<commit_message>
fix: rewrite DOCX export without special unicode chars
</commit_message>
<xml_diff>
--- a/public/proposal-barisapp.docx
+++ b/public/proposal-barisapp.docx
@@ -1,6 +1,6 @@
 
 <file path=word/document.xml><?xml version="1.0" encoding="UTF-8" standalone="yes"?>
-<w:document xmlns:ve="http://schemas.openxmlformats.org/markup-compatibility/2006" xmlns:o="urn:schemas-microsoft-com:office:office" xmlns:r="http://schemas.openxmlformats.org/officeDocument/2006/relationships" xmlns:m="http://schemas.openxmlformats.org/officeDocument/2006/math" xmlns:v="urn:schemas-microsoft-com:vml" xmlns:wp="http://schemas.openxmlformats.org/drawingml/2006/wordprocessingDrawing" xmlns:w10="urn:schemas-microsoft-com:office:word" xmlns:w="http://schemas.openxmlformats.org/wordprocessingml/2006/main" xmlns:wne="http://schemas.microsoft.com/office/word/2006/wordml"><w:body><w:p/><w:p/><w:p/><w:p/><w:p/><w:p/><w:p/><w:p/><w:p><w:pPr><w:jc w:val="center"/></w:pPr><w:r><w:rPr><w:color w:val="0062FF"/><w:sz w:val="12"/><w:szCs w:val="12"/></w:rPr><w:t xml:space="preserve">━════════════════════════════════════════</w:t></w:r></w:p><w:p/><w:p/><w:p><w:pPr><w:jc w:val="center"/></w:pPr><w:r><w:rPr><w:rFonts w:ascii="Calibri Light" w:hAnsi="Calibri Light" w:eastAsia="Calibri Light" w:cs="Calibri Light"/><w:color w:val="0062FF"/><w:sz w:val="64"/><w:szCs w:val="64"/><w:b w:val="1"/><w:bCs w:val="1"/></w:rPr><w:t xml:space="preserve">BARIS APP</w:t></w:r></w:p><w:p/><w:p><w:pPr><w:jc w:val="center"/></w:pPr><w:r><w:rPr><w:color w:val="64748B"/><w:sz w:val="32"/><w:szCs w:val="32"/><w:i w:val="1"/><w:iCs w:val="1"/></w:rPr><w:t xml:space="preserve">Platform Manajemen Event & Kompetisi Terpadu</w:t></w:r></w:p><w:p/><w:p><w:pPr><w:jc w:val="center"/></w:pPr><w:r><w:rPr><w:color w:val="0062FF"/><w:sz w:val="12"/><w:szCs w:val="12"/></w:rPr><w:t xml:space="preserve">━════════════════════════════════════════</w:t></w:r></w:p><w:p/><w:p/><w:p/><w:p><w:pPr><w:jc w:val="center"/></w:pPr><w:r><w:rPr><w:color w:val="1E293B"/><w:sz w:val="36"/><w:szCs w:val="36"/><w:b w:val="1"/><w:bCs w:val="1"/></w:rPr><w:t xml:space="preserve">Proposal Aplikasi</w:t></w:r></w:p><w:p/><w:p/><w:p/><w:p/><w:p/><w:p/><w:p><w:pPr><w:jc w:val="center"/></w:pPr><w:r><w:rPr><w:color w:val="475569"/><w:sz w:val="20"/><w:szCs w:val="20"/><w:i w:val="1"/><w:iCs w:val="1"/></w:rPr><w:t xml:space="preserve">Pendaftaran Online  •  Penilaian Digital  •  Voting QRIS  •  Tiket Event Online  •  Livestream Overlay  •  Scoreboard Publik  •  Drawing / Undian  •  Subdomain Kustom</w:t></w:r></w:p><w:p/><w:p/><w:p/><w:p/><w:p><w:pPr><w:jc w:val="center"/></w:pPr><w:r><w:rPr><w:color w:val="94A3B8"/><w:sz w:val="20"/><w:szCs w:val="20"/></w:rPr><w:t xml:space="preserve">20 July 2026</w:t></w:r></w:p><w:p><w:r><w:br w:type="page"/></w:r></w:p><w:p><w:pPr><w:pStyle w:val="Heading1"/></w:pPr><w:bookmarkStart w:id="0" w:name="_Toc0"/><w:r><w:t>Daftar Isi</w:t></w:r><w:bookmarkEnd w:id="0"/></w:p><w:p><w:pPr><w:spacing w:after="80"/></w:pPr><w:r><w:rPr><w:sz w:val="24"/><w:szCs w:val="24"/></w:rPr><w:t xml:space="preserve">1.  Masalah yang Kami Selesaikan</w:t></w:r></w:p><w:p><w:pPr><w:spacing w:after="80"/></w:pPr><w:r><w:rPr><w:sz w:val="24"/><w:szCs w:val="24"/></w:rPr><w:t xml:space="preserve">2.  Kenapa BARIS APP?</w:t></w:r></w:p><w:p><w:pPr><w:spacing w:after="80"/></w:pPr><w:r><w:rPr><w:sz w:val="24"/><w:szCs w:val="24"/></w:rPr><w:t xml:space="preserve">3.  Siapa yang Butuh BARIS APP?</w:t></w:r></w:p><w:p><w:pPr><w:spacing w:after="80"/></w:pPr><w:r><w:rPr><w:sz w:val="24"/><w:szCs w:val="24"/></w:rPr><w:t xml:space="preserve">4.  Perbandingan Biaya</w:t></w:r></w:p><w:p><w:pPr><w:spacing w:after="80"/></w:pPr><w:r><w:rPr><w:sz w:val="24"/><w:szCs w:val="24"/></w:rPr><w:t xml:space="preserve">5.  Fitur Lengkap</w:t></w:r></w:p><w:p><w:pPr><w:spacing w:after="80"/></w:pPr><w:r><w:rPr><w:sz w:val="24"/><w:szCs w:val="24"/></w:rPr><w:t xml:space="preserve">6.  Hubungi Kami</w:t></w:r></w:p><w:p><w:r><w:br w:type="page"/></w:r></w:p><w:p><w:pPr><w:pStyle w:val="Heading1"/></w:pPr><w:bookmarkStart w:id="1" w:name="_Toc1"/><w:r><w:t>Masalah yang Kami Selesaikan</w:t></w:r><w:bookmarkEnd w:id="1"/></w:p><w:p><w:pPr/><w:r><w:rPr><w:rStyle w:val="normal"/></w:rPr><w:t xml:space="preserve">Platform tradisional dalam penyelenggaraan event kompetisi masih menggunakan sistem manual yang merepotkan. BARIS APP hadir sebagai solusi digital all-in-one.</w:t></w:r></w:p><w:tbl><w:tblGrid><w:gridCol w:w="3000" w:type="dxa"/><w:gridCol w:w="3000" w:type="dxa"/><w:gridCol w:w="3000" w:type="dxa"/></w:tblGrid><w:tblPr><w:tblStyle w:val="probTable"/></w:tblPr><w:tr><w:trPr/><w:tc><w:tcPr><w:tcW w:w="3000" w:type="dxa"/><w:shd w:val="clear" w:fill="0062FF"/><w:noWrap/></w:tcPr><w:p><w:pPr/><w:r><w:rPr><w:color w:val="FFFFFF"/><w:sz w:val="20"/><w:szCs w:val="20"/><w:b w:val="1"/><w:bCs w:val="1"/></w:rPr><w:t xml:space="preserve">Masalah</w:t></w:r></w:p></w:tc><w:tc><w:tcPr><w:tcW w:w="3000" w:type="dxa"/><w:shd w:val="clear" w:fill="0062FF"/><w:noWrap/></w:tcPr><w:p><w:pPr/><w:r><w:rPr><w:color w:val="FFFFFF"/><w:sz w:val="20"/><w:szCs w:val="20"/><w:b w:val="1"/><w:bCs w:val="1"/></w:rPr><w:t xml:space="preserve">Dampak</w:t></w:r></w:p></w:tc><w:tc><w:tcPr><w:tcW w:w="3000" w:type="dxa"/><w:shd w:val="clear" w:fill="0062FF"/><w:noWrap/></w:tcPr><w:p><w:pPr/><w:r><w:rPr><w:color w:val="FFFFFF"/><w:sz w:val="20"/><w:szCs w:val="20"/><w:b w:val="1"/><w:bCs w:val="1"/></w:rPr><w:t xml:space="preserve">Solusi BARIS APP</w:t></w:r></w:p></w:tc></w:tr><w:tr><w:trPr/><w:tc><w:tcPr><w:tcW w:w="3000" w:type="dxa"/><w:noWrap/></w:tcPr><w:p><w:pPr/><w:r><w:rPr><w:sz w:val="20"/><w:szCs w:val="20"/></w:rPr><w:t xml:space="preserve">Pendaftaran manual & kertas</w:t></w:r></w:p></w:tc><w:tc><w:tcPr><w:tcW w:w="3000" w:type="dxa"/><w:noWrap/></w:tcPr><w:p><w:pPr/><w:r><w:rPr><w:sz w:val="20"/><w:szCs w:val="20"/></w:rPr><w:t xml:space="preserve">Data hilang, antrean panjang</w:t></w:r></w:p></w:tc><w:tc><w:tcPr><w:tcW w:w="3000" w:type="dxa"/><w:noWrap/></w:tcPr><w:p><w:pPr/><w:r><w:rPr><w:sz w:val="20"/><w:szCs w:val="20"/></w:rPr><w:t xml:space="preserve">Pendaftaran online multi-step + magic link</w:t></w:r></w:p></w:tc></w:tr><w:tr><w:trPr/><w:tc><w:tcPr><w:tcW w:w="3000" w:type="dxa"/><w:noWrap/></w:tcPr><w:p><w:pPr/><w:r><w:rPr><w:sz w:val="20"/><w:szCs w:val="20"/></w:rPr><w:t xml:space="preserve">Penilaian juri pakai kertas</w:t></w:r></w:p></w:tc><w:tc><w:tcPr><w:tcW w:w="3000" w:type="dxa"/><w:noWrap/></w:tcPr><w:p><w:pPr/><w:r><w:rPr><w:sz w:val="20"/><w:szCs w:val="20"/></w:rPr><w:t xml:space="preserve">Rekap lama, rawan manipulasi</w:t></w:r></w:p></w:tc><w:tc><w:tcPr><w:tcW w:w="3000" w:type="dxa"/><w:noWrap/></w:tcPr><w:p><w:pPr/><w:r><w:rPr><w:sz w:val="20"/><w:szCs w:val="20"/></w:rPr><w:t xml:space="preserve">Scoring digital real-time dari HP juri</w:t></w:r></w:p></w:tc></w:tr><w:tr><w:trPr/><w:tc><w:tcPr><w:tcW w:w="3000" w:type="dxa"/><w:noWrap/></w:tcPr><w:p><w:pPr/><w:r><w:rPr><w:sz w:val="20"/><w:szCs w:val="20"/></w:rPr><w:t xml:space="preserve">Voting penonton ribet</w:t></w:r></w:p></w:tc><w:tc><w:tcPr><w:tcW w:w="3000" w:type="dxa"/><w:noWrap/></w:tcPr><w:p><w:pPr/><w:r><w:rPr><w:sz w:val="20"/><w:szCs w:val="20"/></w:rPr><w:t xml:space="preserve">Potensi donasi hilang</w:t></w:r></w:p></w:tc><w:tc><w:tcPr><w:tcW w:w="3000" w:type="dxa"/><w:noWrap/></w:tcPr><w:p><w:pPr/><w:r><w:rPr><w:sz w:val="20"/><w:szCs w:val="20"/></w:rPr><w:t xml:space="preserve">QRIS voting — scan, bayar, hasil langsung</w:t></w:r></w:p></w:tc></w:tr><w:tr><w:trPr/><w:tc><w:tcPr><w:tcW w:w="3000" w:type="dxa"/><w:noWrap/></w:tcPr><w:p><w:pPr/><w:r><w:rPr><w:sz w:val="20"/><w:szCs w:val="20"/></w:rPr><w:t xml:space="preserve">Tiket event antre fisik</w:t></w:r></w:p></w:tc><w:tc><w:tcPr><w:tcW w:w="3000" w:type="dxa"/><w:noWrap/></w:tcPr><w:p><w:pPr/><w:r><w:rPr><w:sz w:val="20"/><w:szCs w:val="20"/></w:rPr><w:t xml:space="preserve">Pemalsuan tiket</w:t></w:r></w:p></w:tc><w:tc><w:tcPr><w:tcW w:w="3000" w:type="dxa"/><w:noWrap/></w:tcPr><w:p><w:pPr/><w:r><w:rPr><w:sz w:val="20"/><w:szCs w:val="20"/></w:rPr><w:t xml:space="preserve">QR Code tiket + scan check-in</w:t></w:r></w:p></w:tc></w:tr><w:tr><w:trPr/><w:tc><w:tcPr><w:tcW w:w="3000" w:type="dxa"/><w:noWrap/></w:tcPr><w:p><w:pPr/><w:r><w:rPr><w:sz w:val="20"/><w:szCs w:val="20"/></w:rPr><w:t xml:space="preserve">Papan skor manual</w:t></w:r></w:p></w:tc><w:tc><w:tcPr><w:tcW w:w="3000" w:type="dxa"/><w:noWrap/></w:tcPr><w:p><w:pPr/><w:r><w:rPr><w:sz w:val="20"/><w:szCs w:val="20"/></w:rPr><w:t xml:space="preserve">Update lambat, nonton bingung</w:t></w:r></w:p></w:tc><w:tc><w:tcPr><w:tcW w:w="3000" w:type="dxa"/><w:noWrap/></w:tcPr><w:p><w:pPr/><w:r><w:rPr><w:sz w:val="20"/><w:szCs w:val="20"/></w:rPr><w:t xml:space="preserve">Overlay OBS profesional + scoreboard publik</w:t></w:r></w:p></w:tc></w:tr><w:tr><w:trPr/><w:tc><w:tcPr><w:tcW w:w="3000" w:type="dxa"/><w:noWrap/></w:tcPr><w:p><w:pPr/><w:r><w:rPr><w:sz w:val="20"/><w:szCs w:val="20"/></w:rPr><w:t xml:space="preserve">Pengumuman juara lambat</w:t></w:r></w:p></w:tc><w:tc><w:tcPr><w:tcW w:w="3000" w:type="dxa"/><w:noWrap/></w:tcPr><w:p><w:pPr/><w:r><w:rPr><w:sz w:val="20"/><w:szCs w:val="20"/></w:rPr><w:t xml:space="preserve">Peserta menunggu</w:t></w:r></w:p></w:tc><w:tc><w:tcPr><w:tcW w:w="3000" w:type="dxa"/><w:noWrap/></w:tcPr><w:p><w:pPr/><w:r><w:rPr><w:sz w:val="20"/><w:szCs w:val="20"/></w:rPr><w:t xml:space="preserve">Champion generator otomatis + PDF ranking</w:t></w:r></w:p></w:tc></w:tr><w:tr><w:trPr/><w:tc><w:tcPr><w:tcW w:w="3000" w:type="dxa"/><w:noWrap/></w:tcPr><w:p><w:pPr/><w:r><w:rPr><w:sz w:val="20"/><w:szCs w:val="20"/></w:rPr><w:t xml:space="preserve">Biaya sewa platform mahal</w:t></w:r></w:p></w:tc><w:tc><w:tcPr><w:tcW w:w="3000" w:type="dxa"/><w:noWrap/></w:tcPr><w:p><w:pPr/><w:r><w:rPr><w:sz w:val="20"/><w:szCs w:val="20"/></w:rPr><w:t xml:space="preserve">Ribuan per bulan</w:t></w:r></w:p></w:tc><w:tc><w:tcPr><w:tcW w:w="3000" w:type="dxa"/><w:noWrap/></w:tcPr><w:p><w:pPr/><w:r><w:rPr><w:sz w:val="20"/><w:szCs w:val="20"/></w:rPr><w:t xml:space="preserve">Bayar sekali, pakai selamanya!</w:t></w:r></w:p></w:tc></w:tr></w:tbl><w:p/><w:p/><w:p><w:pPr><w:jc w:val="center"/></w:pPr><w:r><w:rPr><w:color w:val="CBD5E1"/><w:sz w:val="8"/><w:szCs w:val="8"/></w:rPr><w:t xml:space="preserve">════════════════════════════════════════</w:t></w:r></w:p><w:tbl><w:tblGrid><w:gridCol w:w="10000" w:type="dxa"/></w:tblGrid><w:tblPr><w:tblW w:w="0" w:type="auto"/><w:tblLayout w:type="autofit"/><w:tblCellMar><w:top w:w="200" w:type="dxa"/><w:left w:w="200" w:type="dxa"/><w:right w:w="200" w:type="dxa"/><w:bottom w:w="200" w:type="dxa"/></w:tblCellMar><w:tblBorders><w:top w:val="single" w:sz="6" w:color="CBD5E1"/><w:left w:val="single" w:sz="6" w:color="CBD5E1"/><w:right w:val="single" w:sz="6" w:color="CBD5E1"/><w:bottom w:val="single" w:sz="6" w:color="CBD5E1"/><w:insideH w:val="single" w:sz="6" w:color="CBD5E1"/><w:insideV w:val="single" w:sz="6" w:color="CBD5E1"/></w:tblBorders></w:tblPr><w:tr><w:trPr/><w:tc><w:tcPr><w:tcW w:w="10000" w:type="dxa"/><w:vAlign w:val="center"/><w:shd w:val="clear" w:fill="F8FAFC"/><w:noWrap/></w:tcPr><w:p/><w:p/><w:p/><w:p><w:pPr><w:jc w:val="center"/></w:pPr><w:r><w:rPr><w:color w:val="94A3B8"/><w:sz w:val="28"/><w:szCs w:val="28"/><w:b w:val="1"/><w:bCs w:val="1"/></w:rPr><w:t xml:space="preserve"> [ SCREENSHOT_1 ] </w:t></w:r></w:p><w:p/><w:p><w:pPr><w:jc w:val="center"/></w:pPr><w:r><w:rPr><w:color w:val="64748B"/><w:sz w:val="20"/><w:szCs w:val="20"/><w:i w:val="1"/><w:iCs w:val="1"/></w:rPr><w:t xml:space="preserve">Tampilan halaman pendaftaran event</w:t></w:r></w:p><w:p><w:pPr><w:jc w:val="center"/></w:pPr><w:r><w:rPr><w:color w:val="94A3B8"/><w:sz w:val="16"/><w:szCs w:val="16"/></w:rPr><w:t xml:space="preserve">[ Tempatkan screenshot di sini — ukuran ideal: lebar 600px ]</w:t></w:r></w:p><w:p/><w:p/><w:p/></w:tc></w:tr></w:tbl><w:p><w:pPr><w:jc w:val="center"/></w:pPr><w:r><w:rPr><w:color w:val="CBD5E1"/><w:sz w:val="8"/><w:szCs w:val="8"/></w:rPr><w:t xml:space="preserve">════════════════════════════════════════</w:t></w:r></w:p><w:p/><w:p><w:r><w:br w:type="page"/></w:r></w:p><w:p><w:pPr><w:pStyle w:val="Heading1"/></w:pPr><w:bookmarkStart w:id="2" w:name="_Toc2"/><w:r><w:t>Kenapa BARIS APP?</w:t></w:r><w:bookmarkEnd w:id="2"/></w:p><w:p><w:pPr><w:pStyle w:val="Heading2"/></w:pPr><w:bookmarkStart w:id="3" w:name="_Toc3"/><w:r><w:t>All-in-One Platform</w:t></w:r><w:bookmarkEnd w:id="3"/></w:p><w:p><w:pPr/><w:r><w:rPr><w:rStyle w:val="normal"/></w:rPr><w:t xml:space="preserve">Tidak perlu 5 aplikasi berbeda. Cukup BARIS APP untuk semuanya:</w:t></w:r></w:p><w:tbl><w:tblGrid><w:gridCol w:w="4000" w:type="dxa"/><w:gridCol w:w="5500" w:type="dxa"/></w:tblGrid><w:tblPr><w:tblStyle w:val="fiturTable"/></w:tblPr><w:tr><w:trPr/><w:tc><w:tcPr><w:tcW w:w="4000" w:type="dxa"/><w:shd w:val="clear" w:fill="0062FF"/><w:noWrap/></w:tcPr><w:p><w:pPr/><w:r><w:rPr><w:color w:val="FFFFFF"/><w:sz w:val="20"/><w:szCs w:val="20"/><w:b w:val="1"/><w:bCs w:val="1"/></w:rPr><w:t xml:space="preserve">Fitur</w:t></w:r></w:p></w:tc><w:tc><w:tcPr><w:tcW w:w="5500" w:type="dxa"/><w:shd w:val="clear" w:fill="0062FF"/><w:noWrap/></w:tcPr><w:p><w:pPr/><w:r><w:rPr><w:color w:val="FFFFFF"/><w:sz w:val="20"/><w:szCs w:val="20"/><w:b w:val="1"/><w:bCs w:val="1"/></w:rPr><w:t xml:space="preserve">Manfaat</w:t></w:r></w:p></w:tc></w:tr><w:tr><w:trPr/><w:tc><w:tcPr><w:tcW w:w="4000" w:type="dxa"/><w:noWrap/></w:tcPr><w:p><w:pPr/><w:r><w:rPr><w:sz w:val="20"/><w:szCs w:val="20"/><w:b w:val="1"/><w:bCs w:val="1"/></w:rPr><w:t xml:space="preserve">Landing Page Event</w:t></w:r></w:p></w:tc><w:tc><w:tcPr><w:tcW w:w="5500" w:type="dxa"/><w:noWrap/></w:tcPr><w:p><w:pPr/><w:r><w:rPr><w:sz w:val="20"/><w:szCs w:val="20"/></w:rPr><w:t xml:space="preserve">Halaman publik otomatis dengan tema kustom</w:t></w:r></w:p></w:tc></w:tr><w:tr><w:trPr/><w:tc><w:tcPr><w:tcW w:w="4000" w:type="dxa"/><w:noWrap/></w:tcPr><w:p><w:pPr/><w:r><w:rPr><w:sz w:val="20"/><w:szCs w:val="20"/><w:b w:val="1"/><w:bCs w:val="1"/></w:rPr><w:t xml:space="preserve">Pendaftaran Online</w:t></w:r></w:p></w:tc><w:tc><w:tcPr><w:tcW w:w="5500" w:type="dxa"/><w:noWrap/></w:tcPr><w:p><w:pPr/><w:r><w:rPr><w:sz w:val="20"/><w:szCs w:val="20"/></w:rPr><w:t xml:space="preserve">Sekolah daftar via magic link tanpa perlu buat akun</w:t></w:r></w:p></w:tc></w:tr><w:tr><w:trPr/><w:tc><w:tcPr><w:tcW w:w="4000" w:type="dxa"/><w:noWrap/></w:tcPr><w:p><w:pPr/><w:r><w:rPr><w:sz w:val="20"/><w:szCs w:val="20"/><w:b w:val="1"/><w:bCs w:val="1"/></w:rPr><w:t xml:space="preserve">Manajemen Peserta</w:t></w:r></w:p></w:tc><w:tc><w:tcPr><w:tcW w:w="5500" w:type="dxa"/><w:noWrap/></w:tcPr><w:p><w:pPr/><w:r><w:rPr><w:sz w:val="20"/><w:szCs w:val="20"/></w:rPr><w:t xml:space="preserve">Data tim, pelatih, danton, upload berkas</w:t></w:r></w:p></w:tc></w:tr><w:tr><w:trPr/><w:tc><w:tcPr><w:tcW w:w="4000" w:type="dxa"/><w:noWrap/></w:tcPr><w:p><w:pPr/><w:r><w:rPr><w:sz w:val="20"/><w:szCs w:val="20"/><w:b w:val="1"/><w:bCs w:val="1"/></w:rPr><w:t xml:space="preserve">Penilaian Digital</w:t></w:r></w:p></w:tc><w:tc><w:tcPr><w:tcW w:w="5500" w:type="dxa"/><w:noWrap/></w:tcPr><w:p><w:pPr/><w:r><w:rPr><w:sz w:val="20"/><w:szCs w:val="20"/></w:rPr><w:t xml:space="preserve">Juri nilai via HP, skor otomatis terkalkulasi</w:t></w:r></w:p></w:tc></w:tr><w:tr><w:trPr/><w:tc><w:tcPr><w:tcW w:w="4000" w:type="dxa"/><w:noWrap/></w:tcPr><w:p><w:pPr/><w:r><w:rPr><w:sz w:val="20"/><w:szCs w:val="20"/><w:b w:val="1"/><w:bCs w:val="1"/></w:rPr><w:t xml:space="preserve">Champion Generator</w:t></w:r></w:p></w:tc><w:tc><w:tcPr><w:tcW w:w="5500" w:type="dxa"/><w:noWrap/></w:tcPr><w:p><w:pPr/><w:r><w:rPr><w:sz w:val="20"/><w:szCs w:val="20"/></w:rPr><w:t xml:space="preserve">Juara otomatis dari akumulasi nilai + tiebreak</w:t></w:r></w:p></w:tc></w:tr><w:tr><w:trPr/><w:tc><w:tcPr><w:tcW w:w="4000" w:type="dxa"/><w:noWrap/></w:tcPr><w:p><w:pPr/><w:r><w:rPr><w:sz w:val="20"/><w:szCs w:val="20"/><w:b w:val="1"/><w:bCs w:val="1"/></w:rPr><w:t xml:space="preserve">Vote Berbayar QRIS</w:t></w:r></w:p></w:tc><w:tc><w:tcPr><w:tcW w:w="5500" w:type="dxa"/><w:noWrap/></w:tcPr><w:p><w:pPr/><w:r><w:rPr><w:sz w:val="20"/><w:szCs w:val="20"/></w:rPr><w:t xml:space="preserve">Dana masuk real-time via scan QRIS</w:t></w:r></w:p></w:tc></w:tr><w:tr><w:trPr/><w:tc><w:tcPr><w:tcW w:w="4000" w:type="dxa"/><w:noWrap/></w:tcPr><w:p><w:pPr/><w:r><w:rPr><w:sz w:val="20"/><w:szCs w:val="20"/><w:b w:val="1"/><w:bCs w:val="1"/></w:rPr><w:t xml:space="preserve">Tiket Event QRIS</w:t></w:r></w:p></w:tc><w:tc><w:tcPr><w:tcW w:w="5500" w:type="dxa"/><w:noWrap/></w:tcPr><w:p><w:pPr/><w:r><w:rPr><w:sz w:val="20"/><w:szCs w:val="20"/></w:rPr><w:t xml:space="preserve">Jual tiket online + QR Code check-in</w:t></w:r></w:p></w:tc></w:tr><w:tr><w:trPr/><w:tc><w:tcPr><w:tcW w:w="4000" w:type="dxa"/><w:noWrap/></w:tcPr><w:p><w:pPr/><w:r><w:rPr><w:sz w:val="20"/><w:szCs w:val="20"/><w:b w:val="1"/><w:bCs w:val="1"/></w:rPr><w:t xml:space="preserve">Drawing / Undian</w:t></w:r></w:p></w:tc><w:tc><w:tcPr><w:tcW w:w="5500" w:type="dxa"/><w:noWrap/></w:tcPr><w:p><w:pPr/><w:r><w:rPr><w:sz w:val="20"/><w:szCs w:val="20"/></w:rPr><w:t xml:space="preserve">Layar spin peserta untuk pengundian</w:t></w:r></w:p></w:tc></w:tr><w:tr><w:trPr/><w:tc><w:tcPr><w:tcW w:w="4000" w:type="dxa"/><w:noWrap/></w:tcPr><w:p><w:pPr/><w:r><w:rPr><w:sz w:val="20"/><w:szCs w:val="20"/><w:b w:val="1"/><w:bCs w:val="1"/></w:rPr><w:t xml:space="preserve">Livestream Overlay</w:t></w:r></w:p></w:tc><w:tc><w:tcPr><w:tcW w:w="5500" w:type="dxa"/><w:noWrap/></w:tcPr><w:p><w:pPr/><w:r><w:rPr><w:sz w:val="20"/><w:szCs w:val="20"/></w:rPr><w:t xml:space="preserve">Tampilan profesional untuk siaran langsung OBS</w:t></w:r></w:p></w:tc></w:tr><w:tr><w:trPr/><w:tc><w:tcPr><w:tcW w:w="4000" w:type="dxa"/><w:noWrap/></w:tcPr><w:p><w:pPr/><w:r><w:rPr><w:sz w:val="20"/><w:szCs w:val="20"/><w:b w:val="1"/><w:bCs w:val="1"/></w:rPr><w:t xml:space="preserve">Live Scoreboard</w:t></w:r></w:p></w:tc><w:tc><w:tcPr><w:tcW w:w="5500" w:type="dxa"/><w:noWrap/></w:tcPr><w:p><w:pPr/><w:r><w:rPr><w:sz w:val="20"/><w:szCs w:val="20"/></w:rPr><w:t xml:space="preserve">Papan skor real-time untuk penonton</w:t></w:r></w:p></w:tc></w:tr><w:tr><w:trPr/><w:tc><w:tcPr><w:tcW w:w="4000" w:type="dxa"/><w:noWrap/></w:tcPr><w:p><w:pPr/><w:r><w:rPr><w:sz w:val="20"/><w:szCs w:val="20"/><w:b w:val="1"/><w:bCs w:val="1"/></w:rPr><w:t xml:space="preserve">Sponsor & Tenant</w:t></w:r></w:p></w:tc><w:tc><w:tcPr><w:tcW w:w="5500" w:type="dxa"/><w:noWrap/></w:tcPr><w:p><w:pPr/><w:r><w:rPr><w:sz w:val="20"/><w:szCs w:val="20"/></w:rPr><w:t xml:space="preserve">Kelola dan tampilkan partner event</w:t></w:r></w:p></w:tc></w:tr><w:tr><w:trPr/><w:tc><w:tcPr><w:tcW w:w="4000" w:type="dxa"/><w:noWrap/></w:tcPr><w:p><w:pPr/><w:r><w:rPr><w:sz w:val="20"/><w:szCs w:val="20"/><w:b w:val="1"/><w:bCs w:val="1"/></w:rPr><w:t xml:space="preserve">Subdomain Sendiri</w:t></w:r></w:p></w:tc><w:tc><w:tcPr><w:tcW w:w="5500" w:type="dxa"/><w:noWrap/></w:tcPr><w:p><w:pPr/><w:r><w:rPr><w:sz w:val="20"/><w:szCs w:val="20"/></w:rPr><w:t xml:space="preserve">nama-event.berbaris.app — branding event sendiri</w:t></w:r></w:p></w:tc></w:tr></w:tbl><w:p/><w:p/><w:p><w:pPr><w:jc w:val="center"/></w:pPr><w:r><w:rPr><w:color w:val="CBD5E1"/><w:sz w:val="8"/><w:szCs w:val="8"/></w:rPr><w:t xml:space="preserve">════════════════════════════════════════</w:t></w:r></w:p><w:tbl><w:tblGrid><w:gridCol w:w="10000" w:type="dxa"/></w:tblGrid><w:tblPr><w:tblW w:w="0" w:type="auto"/><w:tblLayout w:type="autofit"/><w:tblCellMar><w:top w:w="200" w:type="dxa"/><w:left w:w="200" w:type="dxa"/><w:right w:w="200" w:type="dxa"/><w:bottom w:w="200" w:type="dxa"/></w:tblCellMar><w:tblBorders><w:top w:val="single" w:sz="6" w:color="CBD5E1"/><w:left w:val="single" w:sz="6" w:color="CBD5E1"/><w:right w:val="single" w:sz="6" w:color="CBD5E1"/><w:bottom w:val="single" w:sz="6" w:color="CBD5E1"/><w:insideH w:val="single" w:sz="6" w:color="CBD5E1"/><w:insideV w:val="single" w:sz="6" w:color="CBD5E1"/></w:tblBorders></w:tblPr><w:tr><w:trPr/><w:tc><w:tcPr><w:tcW w:w="10000" w:type="dxa"/><w:vAlign w:val="center"/><w:shd w:val="clear" w:fill="F8FAFC"/><w:noWrap/></w:tcPr><w:p/><w:p/><w:p/><w:p><w:pPr><w:jc w:val="center"/></w:pPr><w:r><w:rPr><w:color w:val="94A3B8"/><w:sz w:val="28"/><w:szCs w:val="28"/><w:b w:val="1"/><w:bCs w:val="1"/></w:rPr><w:t xml:space="preserve"> [ SCREENSHOT_2 ] </w:t></w:r></w:p><w:p/><w:p><w:pPr><w:jc w:val="center"/></w:pPr><w:r><w:rPr><w:color w:val="64748B"/><w:sz w:val="20"/><w:szCs w:val="20"/><w:i w:val="1"/><w:iCs w:val="1"/></w:rPr><w:t xml:space="preserve">Tampilan dashboard eventner</w:t></w:r></w:p><w:p><w:pPr><w:jc w:val="center"/></w:pPr><w:r><w:rPr><w:color w:val="94A3B8"/><w:sz w:val="16"/><w:szCs w:val="16"/></w:rPr><w:t xml:space="preserve">[ Tempatkan screenshot di sini — ukuran ideal: lebar 600px ]</w:t></w:r></w:p><w:p/><w:p/><w:p/></w:tc></w:tr></w:tbl><w:p><w:pPr><w:jc w:val="center"/></w:pPr><w:r><w:rPr><w:color w:val="CBD5E1"/><w:sz w:val="8"/><w:szCs w:val="8"/></w:rPr><w:t xml:space="preserve">════════════════════════════════════════</w:t></w:r></w:p><w:p/><w:p/><w:p><w:pPr><w:pStyle w:val="Heading2"/></w:pPr><w:bookmarkStart w:id="4" w:name="_Toc4"/><w:r><w:t>Mudah Digunakan</w:t></w:r><w:bookmarkEnd w:id="4"/></w:p><w:p><w:pPr><w:spacing w:after="60"/></w:pPr><w:r><w:rPr><w:sz w:val="22"/><w:szCs w:val="22"/></w:rPr><w:t xml:space="preserve">✓  Peserta:  Tidak perlu daftar akun — cukup klik magic link dari email</w:t></w:r></w:p><w:p><w:pPr><w:spacing w:after="60"/></w:pPr><w:r><w:rPr><w:sz w:val="22"/><w:szCs w:val="22"/></w:rPr><w:t xml:space="preserve">✓  Juri:  Buka link, nilai langsung, simpan — dari HP mana pun</w:t></w:r></w:p><w:p><w:pPr><w:spacing w:after="60"/></w:pPr><w:r><w:rPr><w:sz w:val="22"/><w:szCs w:val="22"/></w:rPr><w:t xml:space="preserve">✓  Panitia:  Satu dashboard untuk semua kontrol event</w:t></w:r></w:p><w:p><w:pPr><w:spacing w:after="60"/></w:pPr><w:r><w:rPr><w:sz w:val="22"/><w:szCs w:val="22"/></w:rPr><w:t xml:space="preserve">✓  Penonton:  Scan QRIS untuk vote, lihat scoreboard real-time</w:t></w:r></w:p><w:p/><w:p/><w:p><w:pPr><w:jc w:val="center"/></w:pPr><w:r><w:rPr><w:color w:val="CBD5E1"/><w:sz w:val="8"/><w:szCs w:val="8"/></w:rPr><w:t xml:space="preserve">════════════════════════════════════════</w:t></w:r></w:p><w:tbl><w:tblGrid><w:gridCol w:w="10000" w:type="dxa"/></w:tblGrid><w:tblPr><w:tblW w:w="0" w:type="auto"/><w:tblLayout w:type="autofit"/><w:tblCellMar><w:top w:w="200" w:type="dxa"/><w:left w:w="200" w:type="dxa"/><w:right w:w="200" w:type="dxa"/><w:bottom w:w="200" w:type="dxa"/></w:tblCellMar><w:tblBorders><w:top w:val="single" w:sz="6" w:color="CBD5E1"/><w:left w:val="single" w:sz="6" w:color="CBD5E1"/><w:right w:val="single" w:sz="6" w:color="CBD5E1"/><w:bottom w:val="single" w:sz="6" w:color="CBD5E1"/><w:insideH w:val="single" w:sz="6" w:color="CBD5E1"/><w:insideV w:val="single" w:sz="6" w:color="CBD5E1"/></w:tblBorders></w:tblPr><w:tr><w:trPr/><w:tc><w:tcPr><w:tcW w:w="10000" w:type="dxa"/><w:vAlign w:val="center"/><w:shd w:val="clear" w:fill="F8FAFC"/><w:noWrap/></w:tcPr><w:p/><w:p/><w:p/><w:p><w:pPr><w:jc w:val="center"/></w:pPr><w:r><w:rPr><w:color w:val="94A3B8"/><w:sz w:val="28"/><w:szCs w:val="28"/><w:b w:val="1"/><w:bCs w:val="1"/></w:rPr><w:t xml:space="preserve"> [ SCREENSHOT_3 ] </w:t></w:r></w:p><w:p/><w:p><w:pPr><w:jc w:val="center"/></w:pPr><w:r><w:rPr><w:color w:val="64748B"/><w:sz w:val="20"/><w:szCs w:val="20"/><w:i w:val="1"/><w:iCs w:val="1"/></w:rPr><w:t xml:space="preserve">Tampilan halaman vote publik</w:t></w:r></w:p><w:p><w:pPr><w:jc w:val="center"/></w:pPr><w:r><w:rPr><w:color w:val="94A3B8"/><w:sz w:val="16"/><w:szCs w:val="16"/></w:rPr><w:t xml:space="preserve">[ Tempatkan screenshot di sini — ukuran ideal: lebar 600px ]</w:t></w:r></w:p><w:p/><w:p/><w:p/></w:tc></w:tr></w:tbl><w:p><w:pPr><w:jc w:val="center"/></w:pPr><w:r><w:rPr><w:color w:val="CBD5E1"/><w:sz w:val="8"/><w:szCs w:val="8"/></w:rPr><w:t xml:space="preserve">════════════════════════════════════════</w:t></w:r></w:p><w:p/><w:p><w:r><w:br w:type="page"/></w:r></w:p><w:p><w:pPr><w:pStyle w:val="Heading2"/></w:pPr><w:bookmarkStart w:id="5" w:name="_Toc5"/><w:r><w:t>Harga Terjangkau</w:t></w:r><w:bookmarkEnd w:id="5"/></w:p><w:p><w:pPr><w:spacing w:after="200"/></w:pPr><w:r><w:rPr><w:color w:val="0062FF"/><w:sz w:val="24"/><w:szCs w:val="24"/><w:b w:val="1"/><w:bCs w:val="1"/></w:rPr><w:t xml:space="preserve">Bayar SEKALI — 1 event bisa melayani ribuan peserta, puluhan juri, ratusan vote — TANPA BIAYA TAMBAHAN.</w:t></w:r></w:p><w:tbl><w:tblGrid><w:gridCol w:w="3000" w:type="dxa"/><w:gridCol w:w="2000" w:type="dxa"/><w:gridCol w:w="5000" w:type="dxa"/></w:tblGrid><w:tblPr><w:tblStyle w:val="priceTable"/></w:tblPr><w:tr><w:trPr/><w:tc><w:tcPr><w:tcW w:w="3000" w:type="dxa"/><w:shd w:val="clear" w:fill="0062FF"/><w:noWrap/></w:tcPr><w:p><w:pPr/><w:r><w:rPr><w:color w:val="FFFFFF"/><w:sz w:val="22"/><w:szCs w:val="22"/><w:b w:val="1"/><w:bCs w:val="1"/></w:rPr><w:t xml:space="preserve">Paket</w:t></w:r></w:p></w:tc><w:tc><w:tcPr><w:tcW w:w="2000" w:type="dxa"/><w:shd w:val="clear" w:fill="0062FF"/><w:noWrap/></w:tcPr><w:p><w:pPr/><w:r><w:rPr><w:color w:val="FFFFFF"/><w:sz w:val="22"/><w:szCs w:val="22"/><w:b w:val="1"/><w:bCs w:val="1"/></w:rPr><w:t xml:space="preserve">Harga</w:t></w:r></w:p></w:tc><w:tc><w:tcPr><w:tcW w:w="5000" w:type="dxa"/><w:shd w:val="clear" w:fill="0062FF"/><w:noWrap/></w:tcPr><w:p><w:pPr/><w:r><w:rPr><w:color w:val="FFFFFF"/><w:sz w:val="22"/><w:szCs w:val="22"/><w:b w:val="1"/><w:bCs w:val="1"/></w:rPr><w:t xml:space="preserve">Keterangan</w:t></w:r></w:p></w:tc></w:tr><w:tr><w:trPr/><w:tc><w:tcPr><w:tcW w:w="3000" w:type="dxa"/><w:noWrap/></w:tcPr><w:p><w:pPr/><w:r><w:rPr><w:color w:val="16A34A"/><w:sz w:val="22"/><w:szCs w:val="22"/><w:b w:val="1"/><w:bCs w:val="1"/></w:rPr><w:t xml:space="preserve">Gratis</w:t></w:r></w:p></w:tc><w:tc><w:tcPr><w:tcW w:w="2000" w:type="dxa"/><w:noWrap/></w:tcPr><w:p><w:pPr/><w:r><w:rPr><w:sz w:val="22"/><w:szCs w:val="22"/><w:b w:val="1"/><w:bCs w:val="1"/></w:rPr><w:t xml:space="preserve">Rp 0</w:t></w:r></w:p></w:tc><w:tc><w:tcPr><w:tcW w:w="5000" w:type="dxa"/><w:noWrap/></w:tcPr><w:p><w:pPr/><w:r><w:rPr><w:sz w:val="20"/><w:szCs w:val="20"/></w:rPr><w:t xml:space="preserve">Trial 3 hari — eksplorasi semua fitur premium</w:t></w:r></w:p></w:tc></w:tr><w:tr><w:trPr/><w:tc><w:tcPr><w:tcW w:w="3000" w:type="dxa"/><w:noWrap/></w:tcPr><w:p><w:pPr/><w:r><w:rPr><w:color w:val="0062FF"/><w:sz w:val="22"/><w:szCs w:val="22"/><w:b w:val="1"/><w:bCs w:val="1"/></w:rPr><w:t xml:space="preserve">Berbayar</w:t></w:r></w:p></w:tc><w:tc><w:tcPr><w:tcW w:w="2000" w:type="dxa"/><w:noWrap/></w:tcPr><w:p><w:pPr/><w:r><w:rPr><w:color w:val="0062FF"/><w:sz w:val="22"/><w:szCs w:val="22"/><w:b w:val="1"/><w:bCs w:val="1"/></w:rPr><w:t xml:space="preserve">Rp 50.000</w:t></w:r></w:p></w:tc><w:tc><w:tcPr><w:tcW w:w="5000" w:type="dxa"/><w:noWrap/></w:tcPr><w:p><w:pPr/><w:r><w:rPr><w:sz w:val="20"/><w:szCs w:val="20"/></w:rPr><w:t xml:space="preserve">Sekali bayar — semua fitur terbuka permanen</w:t></w:r></w:p></w:tc></w:tr></w:tbl><w:p/><w:p/><w:p><w:pPr><w:jc w:val="center"/></w:pPr><w:r><w:rPr><w:color w:val="CBD5E1"/><w:sz w:val="8"/><w:szCs w:val="8"/></w:rPr><w:t xml:space="preserve">════════════════════════════════════════</w:t></w:r></w:p><w:tbl><w:tblGrid><w:gridCol w:w="10000" w:type="dxa"/></w:tblGrid><w:tblPr><w:tblW w:w="0" w:type="auto"/><w:tblLayout w:type="autofit"/><w:tblCellMar><w:top w:w="200" w:type="dxa"/><w:left w:w="200" w:type="dxa"/><w:right w:w="200" w:type="dxa"/><w:bottom w:w="200" w:type="dxa"/></w:tblCellMar><w:tblBorders><w:top w:val="single" w:sz="6" w:color="CBD5E1"/><w:left w:val="single" w:sz="6" w:color="CBD5E1"/><w:right w:val="single" w:sz="6" w:color="CBD5E1"/><w:bottom w:val="single" w:sz="6" w:color="CBD5E1"/><w:insideH w:val="single" w:sz="6" w:color="CBD5E1"/><w:insideV w:val="single" w:sz="6" w:color="CBD5E1"/></w:tblBorders></w:tblPr><w:tr><w:trPr/><w:tc><w:tcPr><w:tcW w:w="10000" w:type="dxa"/><w:vAlign w:val="center"/><w:shd w:val="clear" w:fill="F8FAFC"/><w:noWrap/></w:tcPr><w:p/><w:p/><w:p/><w:p><w:pPr><w:jc w:val="center"/></w:pPr><w:r><w:rPr><w:color w:val="94A3B8"/><w:sz w:val="28"/><w:szCs w:val="28"/><w:b w:val="1"/><w:bCs w:val="1"/></w:rPr><w:t xml:space="preserve"> [ SCREENSHOT_4 ] </w:t></w:r></w:p><w:p/><w:p><w:pPr><w:jc w:val="center"/></w:pPr><w:r><w:rPr><w:color w:val="64748B"/><w:sz w:val="20"/><w:szCs w:val="20"/><w:i w:val="1"/><w:iCs w:val="1"/></w:rPr><w:t xml:space="preserve">Tampilan halaman pembayaran QRIS</w:t></w:r></w:p><w:p><w:pPr><w:jc w:val="center"/></w:pPr><w:r><w:rPr><w:color w:val="94A3B8"/><w:sz w:val="16"/><w:szCs w:val="16"/></w:rPr><w:t xml:space="preserve">[ Tempatkan screenshot di sini — ukuran ideal: lebar 600px ]</w:t></w:r></w:p><w:p/><w:p/><w:p/></w:tc></w:tr></w:tbl><w:p><w:pPr><w:jc w:val="center"/></w:pPr><w:r><w:rPr><w:color w:val="CBD5E1"/><w:sz w:val="8"/><w:szCs w:val="8"/></w:rPr><w:t xml:space="preserve">════════════════════════════════════════</w:t></w:r></w:p><w:p/><w:p><w:r><w:br w:type="page"/></w:r></w:p><w:p><w:pPr><w:pStyle w:val="Heading2"/></w:pPr><w:bookmarkStart w:id="6" w:name="_Toc6"/><w:r><w:t>Branding Profesional</w:t></w:r><w:bookmarkEnd w:id="6"/></w:p><w:p><w:pPr><w:spacing w:after="60"/></w:pPr><w:r><w:rPr><w:sz w:val="22"/><w:szCs w:val="22"/></w:rPr><w:t xml:space="preserve">✦  Subdomain kustom: kejurcab-cianjur.berbaris.app</w:t></w:r></w:p><w:p><w:pPr><w:spacing w:after="60"/></w:pPr><w:r><w:rPr><w:sz w:val="22"/><w:szCs w:val="22"/></w:rPr><w:t xml:space="preserve">✦  Tema warna: Sesuaikan dengan warna acara Anda</w:t></w:r></w:p><w:p><w:pPr><w:spacing w:after="60"/></w:pPr><w:r><w:rPr><w:sz w:val="22"/><w:szCs w:val="22"/></w:rPr><w:t xml:space="preserve">✦  Logo & Poster: Upload logo dan poster event</w:t></w:r></w:p><w:p><w:pPr><w:spacing w:after="60"/></w:pPr><w:r><w:rPr><w:sz w:val="22"/><w:szCs w:val="22"/></w:rPr><w:t xml:space="preserve">✦  Font kustom: Pilih font untuk halaman publik</w:t></w:r></w:p><w:p><w:pPr><w:spacing w:after="60"/></w:pPr><w:r><w:rPr><w:sz w:val="22"/><w:szCs w:val="22"/></w:rPr><w:t xml:space="preserve">✦  Overlay OBS: Tampilan profesional untuk siaran langsung</w:t></w:r></w:p><w:p/><w:p/><w:p><w:pPr><w:jc w:val="center"/></w:pPr><w:r><w:rPr><w:color w:val="CBD5E1"/><w:sz w:val="8"/><w:szCs w:val="8"/></w:rPr><w:t xml:space="preserve">════════════════════════════════════════</w:t></w:r></w:p><w:tbl><w:tblGrid><w:gridCol w:w="10000" w:type="dxa"/></w:tblGrid><w:tblPr><w:tblW w:w="0" w:type="auto"/><w:tblLayout w:type="autofit"/><w:tblCellMar><w:top w:w="200" w:type="dxa"/><w:left w:w="200" w:type="dxa"/><w:right w:w="200" w:type="dxa"/><w:bottom w:w="200" w:type="dxa"/></w:tblCellMar><w:tblBorders><w:top w:val="single" w:sz="6" w:color="CBD5E1"/><w:left w:val="single" w:sz="6" w:color="CBD5E1"/><w:right w:val="single" w:sz="6" w:color="CBD5E1"/><w:bottom w:val="single" w:sz="6" w:color="CBD5E1"/><w:insideH w:val="single" w:sz="6" w:color="CBD5E1"/><w:insideV w:val="single" w:sz="6" w:color="CBD5E1"/></w:tblBorders></w:tblPr><w:tr><w:trPr/><w:tc><w:tcPr><w:tcW w:w="10000" w:type="dxa"/><w:vAlign w:val="center"/><w:shd w:val="clear" w:fill="F8FAFC"/><w:noWrap/></w:tcPr><w:p/><w:p/><w:p/><w:p><w:pPr><w:jc w:val="center"/></w:pPr><w:r><w:rPr><w:color w:val="94A3B8"/><w:sz w:val="28"/><w:szCs w:val="28"/><w:b w:val="1"/><w:bCs w:val="1"/></w:rPr><w:t xml:space="preserve"> [ SCREENSHOT_5 ] </w:t></w:r></w:p><w:p/><w:p><w:pPr><w:jc w:val="center"/></w:pPr><w:r><w:rPr><w:color w:val="64748B"/><w:sz w:val="20"/><w:szCs w:val="20"/><w:i w:val="1"/><w:iCs w:val="1"/></w:rPr><w:t xml:space="preserve">Tampilan halaman event dengan tema kustom</w:t></w:r></w:p><w:p><w:pPr><w:jc w:val="center"/></w:pPr><w:r><w:rPr><w:color w:val="94A3B8"/><w:sz w:val="16"/><w:szCs w:val="16"/></w:rPr><w:t xml:space="preserve">[ Tempatkan screenshot di sini — ukuran ideal: lebar 600px ]</w:t></w:r></w:p><w:p/><w:p/><w:p/></w:tc></w:tr></w:tbl><w:p><w:pPr><w:jc w:val="center"/></w:pPr><w:r><w:rPr><w:color w:val="CBD5E1"/><w:sz w:val="8"/><w:szCs w:val="8"/></w:rPr><w:t xml:space="preserve">════════════════════════════════════════</w:t></w:r></w:p><w:p/><w:p><w:r><w:br w:type="page"/></w:r></w:p><w:p><w:pPr><w:pStyle w:val="Heading1"/></w:pPr><w:bookmarkStart w:id="7" w:name="_Toc7"/><w:r><w:t>Siapa yang Butuh BARIS APP?</w:t></w:r><w:bookmarkEnd w:id="7"/></w:p><w:tbl><w:tblGrid><w:gridCol w:w="3500" w:type="dxa"/><w:gridCol w:w="6000" w:type="dxa"/></w:tblGrid><w:tblPr><w:tblStyle w:val="targetTable"/></w:tblPr><w:tr><w:trPr/><w:tc><w:tcPr><w:tcW w:w="3500" w:type="dxa"/><w:shd w:val="clear" w:fill="0062FF"/><w:noWrap/></w:tcPr><w:p><w:pPr/><w:r><w:rPr><w:color w:val="FFFFFF"/><w:sz w:val="20"/><w:szCs w:val="20"/><w:b w:val="1"/><w:bCs w:val="1"/></w:rPr><w:t xml:space="preserve">Target</w:t></w:r></w:p></w:tc><w:tc><w:tcPr><w:tcW w:w="6000" w:type="dxa"/><w:shd w:val="clear" w:fill="0062FF"/><w:noWrap/></w:tcPr><w:p><w:pPr/><w:r><w:rPr><w:color w:val="FFFFFF"/><w:sz w:val="20"/><w:szCs w:val="20"/><w:b w:val="1"/><w:bCs w:val="1"/></w:rPr><w:t xml:space="preserve">Kebutuhan</w:t></w:r></w:p></w:tc></w:tr><w:tr><w:trPr/><w:tc><w:tcPr><w:tcW w:w="3500" w:type="dxa"/><w:noWrap/></w:tcPr><w:p><w:pPr/><w:r><w:rPr><w:sz w:val="20"/><w:szCs w:val="20"/><w:b w:val="1"/><w:bCs w:val="1"/></w:rPr><w:t xml:space="preserve">Sekolah / OSIS</w:t></w:r></w:p></w:tc><w:tc><w:tcPr><w:tcW w:w="6000" w:type="dxa"/><w:noWrap/></w:tcPr><w:p><w:pPr/><w:r><w:rPr><w:sz w:val="20"/><w:szCs w:val="20"/></w:rPr><w:t xml:space="preserve">Lomba PBB & paskibra dengan sistem profesional</w:t></w:r></w:p></w:tc></w:tr><w:tr><w:trPr/><w:tc><w:tcPr><w:tcW w:w="3500" w:type="dxa"/><w:noWrap/></w:tcPr><w:p><w:pPr/><w:r><w:rPr><w:sz w:val="20"/><w:szCs w:val="20"/><w:b w:val="1"/><w:bCs w:val="1"/></w:rPr><w:t xml:space="preserve">Pembina Paskibra</w:t></w:r></w:p></w:tc><w:tc><w:tcPr><w:tcW w:w="6000" w:type="dxa"/><w:noWrap/></w:tcPr><w:p><w:pPr/><w:r><w:rPr><w:sz w:val="20"/><w:szCs w:val="20"/></w:rPr><w:t xml:space="preserve">Penilaian juri transparan & real-time</w:t></w:r></w:p></w:tc></w:tr><w:tr><w:trPr/><w:tc><w:tcPr><w:tcW w:w="3500" w:type="dxa"/><w:noWrap/></w:tcPr><w:p><w:pPr/><w:r><w:rPr><w:sz w:val="20"/><w:szCs w:val="20"/><w:b w:val="1"/><w:bCs w:val="1"/></w:rPr><w:t xml:space="preserve">Pramuka</w:t></w:r></w:p></w:tc><w:tc><w:tcPr><w:tcW w:w="6000" w:type="dxa"/><w:noWrap/></w:tcPr><w:p><w:pPr/><w:r><w:rPr><w:sz w:val="20"/><w:szCs w:val="20"/></w:rPr><w:t xml:space="preserve">Lomba keterampilan tingkat kwarcab/kwaran</w:t></w:r></w:p></w:tc></w:tr><w:tr><w:trPr/><w:tc><w:tcPr><w:tcW w:w="3500" w:type="dxa"/><w:noWrap/></w:tcPr><w:p><w:pPr/><w:r><w:rPr><w:sz w:val="20"/><w:szCs w:val="20"/><w:b w:val="1"/><w:bCs w:val="1"/></w:rPr><w:t xml:space="preserve">Universitas</w:t></w:r></w:p></w:tc><w:tc><w:tcPr><w:tcW w:w="6000" w:type="dxa"/><w:noWrap/></w:tcPr><w:p><w:pPr/><w:r><w:rPr><w:sz w:val="20"/><w:szCs w:val="20"/></w:rPr><w:t xml:space="preserve">UKM, dies natalis, lomba antar fakultas</w:t></w:r></w:p></w:tc></w:tr><w:tr><w:trPr/><w:tc><w:tcPr><w:tcW w:w="3500" w:type="dxa"/><w:noWrap/></w:tcPr><w:p><w:pPr/><w:r><w:rPr><w:sz w:val="20"/><w:szCs w:val="20"/><w:b w:val="1"/><w:bCs w:val="1"/></w:rPr><w:t xml:space="preserve">Pemerintah Daerah</w:t></w:r></w:p></w:tc><w:tc><w:tcPr><w:tcW w:w="6000" w:type="dxa"/><w:noWrap/></w:tcPr><w:p><w:pPr/><w:r><w:rPr><w:sz w:val="20"/><w:szCs w:val="20"/></w:rPr><w:t xml:space="preserve">Event FORBASI tingkat kabupaten/provinsi</w:t></w:r></w:p></w:tc></w:tr><w:tr><w:trPr/><w:tc><w:tcPr><w:tcW w:w="3500" w:type="dxa"/><w:noWrap/></w:tcPr><w:p><w:pPr/><w:r><w:rPr><w:sz w:val="20"/><w:szCs w:val="20"/><w:b w:val="1"/><w:bCs w:val="1"/></w:rPr><w:t xml:space="preserve">Event Organizer</w:t></w:r></w:p></w:tc><w:tc><w:tcPr><w:tcW w:w="6000" w:type="dxa"/><w:noWrap/></w:tcPr><w:p><w:pPr/><w:r><w:rPr><w:sz w:val="20"/><w:szCs w:val="20"/></w:rPr><w:t xml:space="preserve">Platform siap pakai untuk klien event kompetisi</w:t></w:r></w:p></w:tc></w:tr><w:tr><w:trPr/><w:tc><w:tcPr><w:tcW w:w="3500" w:type="dxa"/><w:noWrap/></w:tcPr><w:p><w:pPr/><w:r><w:rPr><w:sz w:val="20"/><w:szCs w:val="20"/><w:b w:val="1"/><w:bCs w:val="1"/></w:rPr><w:t xml:space="preserve">Komunitas</w:t></w:r></w:p></w:tc><w:tc><w:tcPr><w:tcW w:w="6000" w:type="dxa"/><w:noWrap/></w:tcPr><w:p><w:pPr/><w:r><w:rPr><w:sz w:val="20"/><w:szCs w:val="20"/></w:rPr><w:t xml:space="preserve">Turnamen dengan budget terbatas</w:t></w:r></w:p></w:tc></w:tr></w:tbl><w:p/><w:p/><w:p><w:pPr><w:jc w:val="center"/></w:pPr><w:r><w:rPr><w:color w:val="CBD5E1"/><w:sz w:val="8"/><w:szCs w:val="8"/></w:rPr><w:t xml:space="preserve">════════════════════════════════════════</w:t></w:r></w:p><w:tbl><w:tblGrid><w:gridCol w:w="10000" w:type="dxa"/></w:tblGrid><w:tblPr><w:tblW w:w="0" w:type="auto"/><w:tblLayout w:type="autofit"/><w:tblCellMar><w:top w:w="200" w:type="dxa"/><w:left w:w="200" w:type="dxa"/><w:right w:w="200" w:type="dxa"/><w:bottom w:w="200" w:type="dxa"/></w:tblCellMar><w:tblBorders><w:top w:val="single" w:sz="6" w:color="CBD5E1"/><w:left w:val="single" w:sz="6" w:color="CBD5E1"/><w:right w:val="single" w:sz="6" w:color="CBD5E1"/><w:bottom w:val="single" w:sz="6" w:color="CBD5E1"/><w:insideH w:val="single" w:sz="6" w:color="CBD5E1"/><w:insideV w:val="single" w:sz="6" w:color="CBD5E1"/></w:tblBorders></w:tblPr><w:tr><w:trPr/><w:tc><w:tcPr><w:tcW w:w="10000" w:type="dxa"/><w:vAlign w:val="center"/><w:shd w:val="clear" w:fill="F8FAFC"/><w:noWrap/></w:tcPr><w:p/><w:p/><w:p/><w:p><w:pPr><w:jc w:val="center"/></w:pPr><w:r><w:rPr><w:color w:val="94A3B8"/><w:sz w:val="28"/><w:szCs w:val="28"/><w:b w:val="1"/><w:bCs w:val="1"/></w:rPr><w:t xml:space="preserve"> [ SCREENSHOT_6 ] </w:t></w:r></w:p><w:p/><w:p><w:pPr><w:jc w:val="center"/></w:pPr><w:r><w:rPr><w:color w:val="64748B"/><w:sz w:val="20"/><w:szCs w:val="20"/><w:i w:val="1"/><w:iCs w:val="1"/></w:rPr><w:t xml:space="preserve">Tampilan halaman publik event di HP</w:t></w:r></w:p><w:p><w:pPr><w:jc w:val="center"/></w:pPr><w:r><w:rPr><w:color w:val="94A3B8"/><w:sz w:val="16"/><w:szCs w:val="16"/></w:rPr><w:t xml:space="preserve">[ Tempatkan screenshot di sini — ukuran ideal: lebar 600px ]</w:t></w:r></w:p><w:p/><w:p/><w:p/></w:tc></w:tr></w:tbl><w:p><w:pPr><w:jc w:val="center"/></w:pPr><w:r><w:rPr><w:color w:val="CBD5E1"/><w:sz w:val="8"/><w:szCs w:val="8"/></w:rPr><w:t xml:space="preserve">════════════════════════════════════════</w:t></w:r></w:p><w:p/><w:p><w:r><w:br w:type="page"/></w:r></w:p><w:p><w:pPr><w:pStyle w:val="Heading1"/></w:pPr><w:bookmarkStart w:id="8" w:name="_Toc8"/><w:r><w:t>Perbandingan Biaya</w:t></w:r><w:bookmarkEnd w:id="8"/></w:p><w:tbl><w:tblGrid><w:gridCol w:w="3500" w:type="dxa"/><w:gridCol w:w="3500" w:type="dxa"/><w:gridCol w:w="3500" w:type="dxa"/></w:tblGrid><w:tblPr><w:tblStyle w:val="costTable"/></w:tblPr><w:tr><w:trPr/><w:tc><w:tcPr><w:tcW w:w="3500" w:type="dxa"/><w:shd w:val="clear" w:fill="0062FF"/><w:noWrap/></w:tcPr><w:p><w:pPr/><w:r><w:rPr><w:color w:val="FFFFFF"/><w:sz w:val="20"/><w:szCs w:val="20"/><w:b w:val="1"/><w:bCs w:val="1"/></w:rPr><w:t xml:space="preserve">Platform</w:t></w:r></w:p></w:tc><w:tc><w:tcPr><w:tcW w:w="3500" w:type="dxa"/><w:shd w:val="clear" w:fill="0062FF"/><w:noWrap/></w:tcPr><w:p><w:pPr/><w:r><w:rPr><w:color w:val="FFFFFF"/><w:sz w:val="20"/><w:szCs w:val="20"/><w:b w:val="1"/><w:bCs w:val="1"/></w:rPr><w:t xml:space="preserve">Model Harga</w:t></w:r></w:p></w:tc><w:tc><w:tcPr><w:tcW w:w="3500" w:type="dxa"/><w:shd w:val="clear" w:fill="0062FF"/><w:noWrap/></w:tcPr><w:p><w:pPr/><w:r><w:rPr><w:color w:val="FFFFFF"/><w:sz w:val="20"/><w:szCs w:val="20"/><w:b w:val="1"/><w:bCs w:val="1"/></w:rPr><w:t xml:space="preserve">Estimasi / Event</w:t></w:r></w:p></w:tc></w:tr><w:tr><w:trPr/><w:tc><w:tcPr><w:tcW w:w="3500" w:type="dxa"/><w:noWrap/></w:tcPr><w:p><w:pPr/><w:r><w:rPr><w:color w:val="0062FF"/><w:sz w:val="20"/><w:szCs w:val="20"/><w:b w:val="1"/><w:bCs w:val="1"/></w:rPr><w:t xml:space="preserve">BARIS APP</w:t></w:r></w:p></w:tc><w:tc><w:tcPr><w:tcW w:w="3500" w:type="dxa"/><w:noWrap/></w:tcPr><w:p><w:pPr/><w:r><w:rPr><w:sz w:val="20"/><w:szCs w:val="20"/></w:rPr><w:t xml:space="preserve">Sekali bayar</w:t></w:r></w:p></w:tc><w:tc><w:tcPr><w:tcW w:w="3500" w:type="dxa"/><w:noWrap/></w:tcPr><w:p><w:pPr/><w:r><w:rPr><w:sz w:val="20"/><w:szCs w:val="20"/><w:b w:val="1"/><w:bCs w:val="1"/></w:rPr><w:t xml:space="preserve">Rp 50.000</w:t></w:r></w:p></w:tc></w:tr><w:tr><w:trPr/><w:tc><w:tcPr><w:tcW w:w="3500" w:type="dxa"/><w:noWrap/></w:tcPr><w:p><w:pPr/><w:r><w:rPr><w:sz w:val="20"/><w:szCs w:val="20"/></w:rPr><w:t xml:space="preserve">Platform A</w:t></w:r></w:p></w:tc><w:tc><w:tcPr><w:tcW w:w="3500" w:type="dxa"/><w:noWrap/></w:tcPr><w:p><w:pPr/><w:r><w:rPr><w:sz w:val="20"/><w:szCs w:val="20"/></w:rPr><w:t xml:space="preserve">Rp 500rb - 2jt / bulan</w:t></w:r></w:p></w:tc><w:tc><w:tcPr><w:tcW w:w="3500" w:type="dxa"/><w:noWrap/></w:tcPr><w:p><w:pPr/><w:r><w:rPr><w:sz w:val="20"/><w:szCs w:val="20"/></w:rPr><w:t xml:space="preserve">Rp 500.000 - 2.000.000</w:t></w:r></w:p></w:tc></w:tr><w:tr><w:trPr/><w:tc><w:tcPr><w:tcW w:w="3500" w:type="dxa"/><w:noWrap/></w:tcPr><w:p><w:pPr/><w:r><w:rPr><w:sz w:val="20"/><w:szCs w:val="20"/></w:rPr><w:t xml:space="preserve">Manual (kertas)</w:t></w:r></w:p></w:tc><w:tc><w:tcPr><w:tcW w:w="3500" w:type="dxa"/><w:noWrap/></w:tcPr><w:p><w:pPr/><w:r><w:rPr><w:sz w:val="20"/><w:szCs w:val="20"/></w:rPr><w:t xml:space="preserve">Cetak + lembur</w:t></w:r></w:p></w:tc><w:tc><w:tcPr><w:tcW w:w="3500" w:type="dxa"/><w:noWrap/></w:tcPr><w:p><w:pPr/><w:r><w:rPr><w:sz w:val="20"/><w:szCs w:val="20"/></w:rPr><w:t xml:space="preserve">> Rp 300.000 + tenaga</w:t></w:r></w:p></w:tc></w:tr><w:tr><w:trPr/><w:tc><w:tcPr><w:tcW w:w="3500" w:type="dxa"/><w:noWrap/></w:tcPr><w:p><w:pPr/><w:r><w:rPr><w:sz w:val="20"/><w:szCs w:val="20"/></w:rPr><w:t xml:space="preserve">Bangun sendiri</w:t></w:r></w:p></w:tc><w:tc><w:tcPr><w:tcW w:w="3500" w:type="dxa"/><w:noWrap/></w:tcPr><w:p><w:pPr/><w:r><w:rPr><w:sz w:val="20"/><w:szCs w:val="20"/></w:rPr><w:t xml:space="preserve">Developer 3-6 bulan</w:t></w:r></w:p></w:tc><w:tc><w:tcPr><w:tcW w:w="3500" w:type="dxa"/><w:noWrap/></w:tcPr><w:p><w:pPr/><w:r><w:rPr><w:sz w:val="20"/><w:szCs w:val="20"/></w:rPr><w:t xml:space="preserve">> Rp 50.000.000</w:t></w:r></w:p></w:tc></w:tr></w:tbl><w:p/><w:p><w:pPr><w:jc w:val="center"/><w:spacing w:after="200"/></w:pPr><w:r><w:rPr><w:color w:val="16A34A"/><w:sz w:val="24"/><w:szCs w:val="24"/><w:b w:val="1"/><w:bCs w:val="1"/></w:rPr><w:t xml:space="preserve">Hemat hingga 96% dibanding platform lain!</w:t></w:r></w:p><w:p><w:r><w:br w:type="page"/></w:r></w:p><w:p><w:pPr><w:pStyle w:val="Heading1"/></w:pPr><w:bookmarkStart w:id="9" w:name="_Toc9"/><w:r><w:t>Fitur Lengkap</w:t></w:r><w:bookmarkEnd w:id="9"/></w:p><w:p><w:pPr><w:pStyle w:val="Heading2"/></w:pPr><w:bookmarkStart w:id="10" w:name="_Toc10"/><w:r><w:t>Manajemen Event</w:t></w:r><w:bookmarkEnd w:id="10"/></w:p><w:p><w:pPr/><w:r><w:rPr><w:rStyle w:val="normal"/></w:rPr><w:t xml:space="preserve">Profil event lengkap (nama, tanggal, lokasi, venue, deskripsi) — tampilan halaman publik otomatis dengan tema kustom. Tersedia subdomain sendiri untuk branding maksimal.</w:t></w:r></w:p><w:p/><w:p><w:pPr><w:jc w:val="center"/></w:pPr><w:r><w:rPr><w:color w:val="CBD5E1"/><w:sz w:val="8"/><w:szCs w:val="8"/></w:rPr><w:t xml:space="preserve">════════════════════════════════════════</w:t></w:r></w:p><w:tbl><w:tblGrid><w:gridCol w:w="10000" w:type="dxa"/></w:tblGrid><w:tblPr><w:tblW w:w="0" w:type="auto"/><w:tblLayout w:type="autofit"/><w:tblCellMar><w:top w:w="200" w:type="dxa"/><w:left w:w="200" w:type="dxa"/><w:right w:w="200" w:type="dxa"/><w:bottom w:w="200" w:type="dxa"/></w:tblCellMar><w:tblBorders><w:top w:val="single" w:sz="6" w:color="CBD5E1"/><w:left w:val="single" w:sz="6" w:color="CBD5E1"/><w:right w:val="single" w:sz="6" w:color="CBD5E1"/><w:bottom w:val="single" w:sz="6" w:color="CBD5E1"/><w:insideH w:val="single" w:sz="6" w:color="CBD5E1"/><w:insideV w:val="single" w:sz="6" w:color="CBD5E1"/></w:tblBorders></w:tblPr><w:tr><w:trPr/><w:tc><w:tcPr><w:tcW w:w="10000" w:type="dxa"/><w:vAlign w:val="center"/><w:shd w:val="clear" w:fill="F8FAFC"/><w:noWrap/></w:tcPr><w:p/><w:p/><w:p/><w:p><w:pPr><w:jc w:val="center"/></w:pPr><w:r><w:rPr><w:color w:val="94A3B8"/><w:sz w:val="28"/><w:szCs w:val="28"/><w:b w:val="1"/><w:bCs w:val="1"/></w:rPr><w:t xml:space="preserve"> [ SCREENSHOT_7 ] </w:t></w:r></w:p><w:p/><w:p><w:pPr><w:jc w:val="center"/></w:pPr><w:r><w:rPr><w:color w:val="64748B"/><w:sz w:val="20"/><w:szCs w:val="20"/><w:i w:val="1"/><w:iCs w:val="1"/></w:rPr><w:t xml:space="preserve">Profil event — logo, poster, informasi acara</w:t></w:r></w:p><w:p><w:pPr><w:jc w:val="center"/></w:pPr><w:r><w:rPr><w:color w:val="94A3B8"/><w:sz w:val="16"/><w:szCs w:val="16"/></w:rPr><w:t xml:space="preserve">[ Tempatkan screenshot di sini — ukuran ideal: lebar 600px ]</w:t></w:r></w:p><w:p/><w:p/><w:p/></w:tc></w:tr></w:tbl><w:p><w:pPr><w:jc w:val="center"/></w:pPr><w:r><w:rPr><w:color w:val="CBD5E1"/><w:sz w:val="8"/><w:szCs w:val="8"/></w:rPr><w:t xml:space="preserve">════════════════════════════════════════</w:t></w:r></w:p><w:p/><w:p><w:pPr><w:pStyle w:val="Heading2"/></w:pPr><w:bookmarkStart w:id="11" w:name="_Toc11"/><w:r><w:t>Pendaftaran & Peserta</w:t></w:r><w:bookmarkEnd w:id="11"/></w:p><w:p><w:pPr/><w:r><w:rPr><w:rStyle w:val="normal"/></w:rPr><w:t xml:space="preserve">Pendaftaran multi-step: pilih kategori → data sekolah → konfirmasi. Setiap sekolah mendapat magic link via email untuk mengisi data tim tanpa perlu registrasi akun.</w:t></w:r></w:p><w:p/><w:p><w:pPr><w:jc w:val="center"/></w:pPr><w:r><w:rPr><w:color w:val="CBD5E1"/><w:sz w:val="8"/><w:szCs w:val="8"/></w:rPr><w:t xml:space="preserve">════════════════════════════════════════</w:t></w:r></w:p><w:tbl><w:tblGrid><w:gridCol w:w="10000" w:type="dxa"/></w:tblGrid><w:tblPr><w:tblW w:w="0" w:type="auto"/><w:tblLayout w:type="autofit"/><w:tblCellMar><w:top w:w="200" w:type="dxa"/><w:left w:w="200" w:type="dxa"/><w:right w:w="200" w:type="dxa"/><w:bottom w:w="200" w:type="dxa"/></w:tblCellMar><w:tblBorders><w:top w:val="single" w:sz="6" w:color="CBD5E1"/><w:left w:val="single" w:sz="6" w:color="CBD5E1"/><w:right w:val="single" w:sz="6" w:color="CBD5E1"/><w:bottom w:val="single" w:sz="6" w:color="CBD5E1"/><w:insideH w:val="single" w:sz="6" w:color="CBD5E1"/><w:insideV w:val="single" w:sz="6" w:color="CBD5E1"/></w:tblBorders></w:tblPr><w:tr><w:trPr/><w:tc><w:tcPr><w:tcW w:w="10000" w:type="dxa"/><w:vAlign w:val="center"/><w:shd w:val="clear" w:fill="F8FAFC"/><w:noWrap/></w:tcPr><w:p/><w:p/><w:p/><w:p><w:pPr><w:jc w:val="center"/></w:pPr><w:r><w:rPr><w:color w:val="94A3B8"/><w:sz w:val="28"/><w:szCs w:val="28"/><w:b w:val="1"/><w:bCs w:val="1"/></w:rPr><w:t xml:space="preserve"> [ SCREENSHOT_8 ] </w:t></w:r></w:p><w:p/><w:p><w:pPr><w:jc w:val="center"/></w:pPr><w:r><w:rPr><w:color w:val="64748B"/><w:sz w:val="20"/><w:szCs w:val="20"/><w:i w:val="1"/><w:iCs w:val="1"/></w:rPr><w:t xml:space="preserve">Form pendaftaran event — pilih kategori</w:t></w:r></w:p><w:p><w:pPr><w:jc w:val="center"/></w:pPr><w:r><w:rPr><w:color w:val="94A3B8"/><w:sz w:val="16"/><w:szCs w:val="16"/></w:rPr><w:t xml:space="preserve">[ Tempatkan screenshot di sini — ukuran ideal: lebar 600px ]</w:t></w:r></w:p><w:p/><w:p/><w:p/></w:tc></w:tr></w:tbl><w:p><w:pPr><w:jc w:val="center"/></w:pPr><w:r><w:rPr><w:color w:val="CBD5E1"/><w:sz w:val="8"/><w:szCs w:val="8"/></w:rPr><w:t xml:space="preserve">════════════════════════════════════════</w:t></w:r></w:p><w:p/><w:p><w:pPr><w:pStyle w:val="Heading2"/></w:pPr><w:bookmarkStart w:id="12" w:name="_Toc12"/><w:r><w:t>Penilaian Digital</w:t></w:r><w:bookmarkEnd w:id="12"/></w:p><w:p><w:pPr/><w:r><w:rPr><w:rStyle w:val="normal"/></w:rPr><w:t xml:space="preserve">Buat kategori penilaian, sub-kategori, dan kriteria dengan bobot masing-masing. Juri menilai dari HP masing-masing. Skor langsung terkalkulasi. Rekap nilai otomatis per kategori.</w:t></w:r></w:p><w:p/><w:p><w:pPr><w:jc w:val="center"/></w:pPr><w:r><w:rPr><w:color w:val="CBD5E1"/><w:sz w:val="8"/><w:szCs w:val="8"/></w:rPr><w:t xml:space="preserve">════════════════════════════════════════</w:t></w:r></w:p><w:tbl><w:tblGrid><w:gridCol w:w="10000" w:type="dxa"/></w:tblGrid><w:tblPr><w:tblW w:w="0" w:type="auto"/><w:tblLayout w:type="autofit"/><w:tblCellMar><w:top w:w="200" w:type="dxa"/><w:left w:w="200" w:type="dxa"/><w:right w:w="200" w:type="dxa"/><w:bottom w:w="200" w:type="dxa"/></w:tblCellMar><w:tblBorders><w:top w:val="single" w:sz="6" w:color="CBD5E1"/><w:left w:val="single" w:sz="6" w:color="CBD5E1"/><w:right w:val="single" w:sz="6" w:color="CBD5E1"/><w:bottom w:val="single" w:sz="6" w:color="CBD5E1"/><w:insideH w:val="single" w:sz="6" w:color="CBD5E1"/><w:insideV w:val="single" w:sz="6" w:color="CBD5E1"/></w:tblBorders></w:tblPr><w:tr><w:trPr/><w:tc><w:tcPr><w:tcW w:w="10000" w:type="dxa"/><w:vAlign w:val="center"/><w:shd w:val="clear" w:fill="F8FAFC"/><w:noWrap/></w:tcPr><w:p/><w:p/><w:p/><w:p><w:pPr><w:jc w:val="center"/></w:pPr><w:r><w:rPr><w:color w:val="94A3B8"/><w:sz w:val="28"/><w:szCs w:val="28"/><w:b w:val="1"/><w:bCs w:val="1"/></w:rPr><w:t xml:space="preserve"> [ SCREENSHOT_9 ] </w:t></w:r></w:p><w:p/><w:p><w:pPr><w:jc w:val="center"/></w:pPr><w:r><w:rPr><w:color w:val="64748B"/><w:sz w:val="20"/><w:szCs w:val="20"/><w:i w:val="1"/><w:iCs w:val="1"/></w:rPr><w:t xml:space="preserve">Halaman input nilai juri</w:t></w:r></w:p><w:p><w:pPr><w:jc w:val="center"/></w:pPr><w:r><w:rPr><w:color w:val="94A3B8"/><w:sz w:val="16"/><w:szCs w:val="16"/></w:rPr><w:t xml:space="preserve">[ Tempatkan screenshot di sini — ukuran ideal: lebar 600px ]</w:t></w:r></w:p><w:p/><w:p/><w:p/></w:tc></w:tr></w:tbl><w:p><w:pPr><w:jc w:val="center"/></w:pPr><w:r><w:rPr><w:color w:val="CBD5E1"/><w:sz w:val="8"/><w:szCs w:val="8"/></w:rPr><w:t xml:space="preserve">════════════════════════════════════════</w:t></w:r></w:p><w:p/><w:p><w:pPr><w:pStyle w:val="Heading2"/></w:pPr><w:bookmarkStart w:id="13" w:name="_Toc13"/><w:r><w:t>Voting Penonton</w:t></w:r><w:bookmarkEnd w:id="13"/></w:p><w:p><w:pPr/><w:r><w:rPr><w:rStyle w:val="normal"/></w:rPr><w:t xml:space="preserve">Penonton bisa memberikan dukungan via vote berbayar. Pembayaran via QRIS (GoPay, OVO, DANA, ShopeePay, Mobile Banking). Hasil voting live dan bisa di-recap ke PDF.</w:t></w:r></w:p><w:p/><w:p><w:pPr><w:jc w:val="center"/></w:pPr><w:r><w:rPr><w:color w:val="CBD5E1"/><w:sz w:val="8"/><w:szCs w:val="8"/></w:rPr><w:t xml:space="preserve">════════════════════════════════════════</w:t></w:r></w:p><w:tbl><w:tblGrid><w:gridCol w:w="10000" w:type="dxa"/></w:tblGrid><w:tblPr><w:tblW w:w="0" w:type="auto"/><w:tblLayout w:type="autofit"/><w:tblCellMar><w:top w:w="200" w:type="dxa"/><w:left w:w="200" w:type="dxa"/><w:right w:w="200" w:type="dxa"/><w:bottom w:w="200" w:type="dxa"/></w:tblCellMar><w:tblBorders><w:top w:val="single" w:sz="6" w:color="CBD5E1"/><w:left w:val="single" w:sz="6" w:color="CBD5E1"/><w:right w:val="single" w:sz="6" w:color="CBD5E1"/><w:bottom w:val="single" w:sz="6" w:color="CBD5E1"/><w:insideH w:val="single" w:sz="6" w:color="CBD5E1"/><w:insideV w:val="single" w:sz="6" w:color="CBD5E1"/></w:tblBorders></w:tblPr><w:tr><w:trPr/><w:tc><w:tcPr><w:tcW w:w="10000" w:type="dxa"/><w:vAlign w:val="center"/><w:shd w:val="clear" w:fill="F8FAFC"/><w:noWrap/></w:tcPr><w:p/><w:p/><w:p/><w:p><w:pPr><w:jc w:val="center"/></w:pPr><w:r><w:rPr><w:color w:val="94A3B8"/><w:sz w:val="28"/><w:szCs w:val="28"/><w:b w:val="1"/><w:bCs w:val="1"/></w:rPr><w:t xml:space="preserve"> [ SCREENSHOT_10 ] </w:t></w:r></w:p><w:p/><w:p><w:pPr><w:jc w:val="center"/></w:pPr><w:r><w:rPr><w:color w:val="64748B"/><w:sz w:val="20"/><w:szCs w:val="20"/><w:i w:val="1"/><w:iCs w:val="1"/></w:rPr><w:t xml:space="preserve">Halaman voting publik dengan QRIS</w:t></w:r></w:p><w:p><w:pPr><w:jc w:val="center"/></w:pPr><w:r><w:rPr><w:color w:val="94A3B8"/><w:sz w:val="16"/><w:szCs w:val="16"/></w:rPr><w:t xml:space="preserve">[ Tempatkan screenshot di sini — ukuran ideal: lebar 600px ]</w:t></w:r></w:p><w:p/><w:p/><w:p/></w:tc></w:tr></w:tbl><w:p><w:pPr><w:jc w:val="center"/></w:pPr><w:r><w:rPr><w:color w:val="CBD5E1"/><w:sz w:val="8"/><w:szCs w:val="8"/></w:rPr><w:t xml:space="preserve">════════════════════════════════════════</w:t></w:r></w:p><w:p/><w:p><w:pPr><w:pStyle w:val="Heading2"/></w:pPr><w:bookmarkStart w:id="14" w:name="_Toc14"/><w:r><w:t>Tiket Event</w:t></w:r><w:bookmarkEnd w:id="14"/></w:p><w:p><w:pPr/><w:r><w:rPr><w:rStyle w:val="normal"/></w:rPr><w:t xml:space="preserve">Jual tiket event online dengan harga dan kuota sendiri. Pembayaran QRIS otomatis. QR Code tiket untuk check-in di pintu masuk.</w:t></w:r></w:p><w:p/><w:p><w:pPr><w:jc w:val="center"/></w:pPr><w:r><w:rPr><w:color w:val="CBD5E1"/><w:sz w:val="8"/><w:szCs w:val="8"/></w:rPr><w:t xml:space="preserve">════════════════════════════════════════</w:t></w:r></w:p><w:tbl><w:tblGrid><w:gridCol w:w="10000" w:type="dxa"/></w:tblGrid><w:tblPr><w:tblW w:w="0" w:type="auto"/><w:tblLayout w:type="autofit"/><w:tblCellMar><w:top w:w="200" w:type="dxa"/><w:left w:w="200" w:type="dxa"/><w:right w:w="200" w:type="dxa"/><w:bottom w:w="200" w:type="dxa"/></w:tblCellMar><w:tblBorders><w:top w:val="single" w:sz="6" w:color="CBD5E1"/><w:left w:val="single" w:sz="6" w:color="CBD5E1"/><w:right w:val="single" w:sz="6" w:color="CBD5E1"/><w:bottom w:val="single" w:sz="6" w:color="CBD5E1"/><w:insideH w:val="single" w:sz="6" w:color="CBD5E1"/><w:insideV w:val="single" w:sz="6" w:color="CBD5E1"/></w:tblBorders></w:tblPr><w:tr><w:trPr/><w:tc><w:tcPr><w:tcW w:w="10000" w:type="dxa"/><w:vAlign w:val="center"/><w:shd w:val="clear" w:fill="F8FAFC"/><w:noWrap/></w:tcPr><w:p/><w:p/><w:p/><w:p><w:pPr><w:jc w:val="center"/></w:pPr><w:r><w:rPr><w:color w:val="94A3B8"/><w:sz w:val="28"/><w:szCs w:val="28"/><w:b w:val="1"/><w:bCs w:val="1"/></w:rPr><w:t xml:space="preserve"> [ SCREENSHOT_11 ] </w:t></w:r></w:p><w:p/><w:p><w:pPr><w:jc w:val="center"/></w:pPr><w:r><w:rPr><w:color w:val="64748B"/><w:sz w:val="20"/><w:szCs w:val="20"/><w:i w:val="1"/><w:iCs w:val="1"/></w:rPr><w:t xml:space="preserve">Halaman pembelian tiket</w:t></w:r></w:p><w:p><w:pPr><w:jc w:val="center"/></w:pPr><w:r><w:rPr><w:color w:val="94A3B8"/><w:sz w:val="16"/><w:szCs w:val="16"/></w:rPr><w:t xml:space="preserve">[ Tempatkan screenshot di sini — ukuran ideal: lebar 600px ]</w:t></w:r></w:p><w:p/><w:p/><w:p/></w:tc></w:tr></w:tbl><w:p><w:pPr><w:jc w:val="center"/></w:pPr><w:r><w:rPr><w:color w:val="CBD5E1"/><w:sz w:val="8"/><w:szCs w:val="8"/></w:rPr><w:t xml:space="preserve">════════════════════════════════════════</w:t></w:r></w:p><w:p/><w:p><w:pPr><w:pStyle w:val="Heading2"/></w:pPr><w:bookmarkStart w:id="15" w:name="_Toc15"/><w:r><w:t>Livestream Overlay & Scoreboard</w:t></w:r><w:bookmarkEnd w:id="15"/></w:p><w:p><w:pPr/><w:r><w:rPr><w:rStyle w:val="normal"/></w:rPr><w:t xml:space="preserve">Tampilan profesional untuk siaran langsung via OBS. Mode: full view, vote, kegiatan, greenscreen. Dilengkapi marquee leaderboard, komentar vote real-time, dan top voter card. Scoreboard publik bisa diakses siapa saja.</w:t></w:r></w:p><w:p/><w:p><w:pPr><w:jc w:val="center"/></w:pPr><w:r><w:rPr><w:color w:val="CBD5E1"/><w:sz w:val="8"/><w:szCs w:val="8"/></w:rPr><w:t xml:space="preserve">════════════════════════════════════════</w:t></w:r></w:p><w:tbl><w:tblGrid><w:gridCol w:w="10000" w:type="dxa"/></w:tblGrid><w:tblPr><w:tblW w:w="0" w:type="auto"/><w:tblLayout w:type="autofit"/><w:tblCellMar><w:top w:w="200" w:type="dxa"/><w:left w:w="200" w:type="dxa"/><w:right w:w="200" w:type="dxa"/><w:bottom w:w="200" w:type="dxa"/></w:tblCellMar><w:tblBorders><w:top w:val="single" w:sz="6" w:color="CBD5E1"/><w:left w:val="single" w:sz="6" w:color="CBD5E1"/><w:right w:val="single" w:sz="6" w:color="CBD5E1"/><w:bottom w:val="single" w:sz="6" w:color="CBD5E1"/><w:insideH w:val="single" w:sz="6" w:color="CBD5E1"/><w:insideV w:val="single" w:sz="6" w:color="CBD5E1"/></w:tblBorders></w:tblPr><w:tr><w:trPr/><w:tc><w:tcPr><w:tcW w:w="10000" w:type="dxa"/><w:vAlign w:val="center"/><w:shd w:val="clear" w:fill="F8FAFC"/><w:noWrap/></w:tcPr><w:p/><w:p/><w:p/><w:p><w:pPr><w:jc w:val="center"/></w:pPr><w:r><w:rPr><w:color w:val="94A3B8"/><w:sz w:val="28"/><w:szCs w:val="28"/><w:b w:val="1"/><w:bCs w:val="1"/></w:rPr><w:t xml:space="preserve"> [ SCREENSHOT_12 ] </w:t></w:r></w:p><w:p/><w:p><w:pPr><w:jc w:val="center"/></w:pPr><w:r><w:rPr><w:color w:val="64748B"/><w:sz w:val="20"/><w:szCs w:val="20"/><w:i w:val="1"/><w:iCs w:val="1"/></w:rPr><w:t xml:space="preserve">Tampilan livestream overlay dengan leaderboard</w:t></w:r></w:p><w:p><w:pPr><w:jc w:val="center"/></w:pPr><w:r><w:rPr><w:color w:val="94A3B8"/><w:sz w:val="16"/><w:szCs w:val="16"/></w:rPr><w:t xml:space="preserve">[ Tempatkan screenshot di sini — ukuran ideal: lebar 600px ]</w:t></w:r></w:p><w:p/><w:p/><w:p/></w:tc></w:tr></w:tbl><w:p><w:pPr><w:jc w:val="center"/></w:pPr><w:r><w:rPr><w:color w:val="CBD5E1"/><w:sz w:val="8"/><w:szCs w:val="8"/></w:rPr><w:t xml:space="preserve">════════════════════════════════════════</w:t></w:r></w:p><w:p/><w:p><w:pPr><w:pStyle w:val="Heading2"/></w:pPr><w:bookmarkStart w:id="16" w:name="_Toc16"/><w:r><w:t>Drawing, Champion & Lainnya</w:t></w:r><w:bookmarkEnd w:id="16"/></w:p><w:p><w:pPr/><w:r><w:rPr><w:rStyle w:val="normal"/></w:rPr><w:t xml:space="preserve">Drawing / undian dengan layar spin interaktif. Champion generator otomatis berdasarkan akumulasi nilai + pengaturan tiebreak. Kelola sponsor, tenant, FAQ, dan galeri foto event. Aktivitas terekam di activity log.</w:t></w:r></w:p><w:p/><w:p><w:pPr><w:jc w:val="center"/></w:pPr><w:r><w:rPr><w:color w:val="CBD5E1"/><w:sz w:val="8"/><w:szCs w:val="8"/></w:rPr><w:t xml:space="preserve">════════════════════════════════════════</w:t></w:r></w:p><w:tbl><w:tblGrid><w:gridCol w:w="10000" w:type="dxa"/></w:tblGrid><w:tblPr><w:tblW w:w="0" w:type="auto"/><w:tblLayout w:type="autofit"/><w:tblCellMar><w:top w:w="200" w:type="dxa"/><w:left w:w="200" w:type="dxa"/><w:right w:w="200" w:type="dxa"/><w:bottom w:w="200" w:type="dxa"/></w:tblCellMar><w:tblBorders><w:top w:val="single" w:sz="6" w:color="CBD5E1"/><w:left w:val="single" w:sz="6" w:color="CBD5E1"/><w:right w:val="single" w:sz="6" w:color="CBD5E1"/><w:bottom w:val="single" w:sz="6" w:color="CBD5E1"/><w:insideH w:val="single" w:sz="6" w:color="CBD5E1"/><w:insideV w:val="single" w:sz="6" w:color="CBD5E1"/></w:tblBorders></w:tblPr><w:tr><w:trPr/><w:tc><w:tcPr><w:tcW w:w="10000" w:type="dxa"/><w:vAlign w:val="center"/><w:shd w:val="clear" w:fill="F8FAFC"/><w:noWrap/></w:tcPr><w:p/><w:p/><w:p/><w:p><w:pPr><w:jc w:val="center"/></w:pPr><w:r><w:rPr><w:color w:val="94A3B8"/><w:sz w:val="28"/><w:szCs w:val="28"/><w:b w:val="1"/><w:bCs w:val="1"/></w:rPr><w:t xml:space="preserve"> [ SCREENSHOT_13 ] </w:t></w:r></w:p><w:p/><w:p><w:pPr><w:jc w:val="center"/></w:pPr><w:r><w:rPr><w:color w:val="64748B"/><w:sz w:val="20"/><w:szCs w:val="20"/><w:i w:val="1"/><w:iCs w:val="1"/></w:rPr><w:t xml:space="preserve">Halaman drawing / spin undian</w:t></w:r></w:p><w:p><w:pPr><w:jc w:val="center"/></w:pPr><w:r><w:rPr><w:color w:val="94A3B8"/><w:sz w:val="16"/><w:szCs w:val="16"/></w:rPr><w:t xml:space="preserve">[ Tempatkan screenshot di sini — ukuran ideal: lebar 600px ]</w:t></w:r></w:p><w:p/><w:p/><w:p/></w:tc></w:tr></w:tbl><w:p><w:pPr><w:jc w:val="center"/></w:pPr><w:r><w:rPr><w:color w:val="CBD5E1"/><w:sz w:val="8"/><w:szCs w:val="8"/></w:rPr><w:t xml:space="preserve">════════════════════════════════════════</w:t></w:r></w:p><w:p/><w:p><w:r><w:br w:type="page"/></w:r></w:p><w:p><w:pPr><w:pStyle w:val="Heading1"/></w:pPr><w:bookmarkStart w:id="17" w:name="_Toc17"/><w:r><w:t>Hubungi Kami</w:t></w:r><w:bookmarkEnd w:id="17"/></w:p><w:p/><w:p><w:pPr><w:spacing w:after="80"/></w:pPr><w:r><w:rPr><w:sz w:val="24"/><w:szCs w:val="24"/></w:rPr><w:t xml:space="preserve">Website:  https://berbaris.app</w:t></w:r></w:p><w:p><w:pPr><w:spacing w:after="80"/></w:pPr><w:r><w:rPr><w:sz w:val="24"/><w:szCs w:val="24"/></w:rPr><w:t xml:space="preserve">Email:     support@berbaris.app</w:t></w:r></w:p><w:p><w:pPr><w:spacing w:after="200"/></w:pPr><w:r><w:rPr><w:sz w:val="24"/><w:szCs w:val="24"/></w:rPr><w:t xml:space="preserve">Instagram: @berbaris.app</w:t></w:r></w:p><w:p/><w:p><w:pPr><w:jc w:val="center"/></w:pPr><w:r><w:rPr><w:color w:val="0062FF"/><w:sz w:val="12"/><w:szCs w:val="12"/></w:rPr><w:t xml:space="preserve">━════════════════════════════════════════</w:t></w:r></w:p><w:p/><w:p><w:pPr><w:jc w:val="center"/><w:spacing w:after="100"/></w:pPr><w:r><w:rPr><w:color w:val="475569"/><w:sz w:val="22"/><w:szCs w:val="22"/><w:i w:val="1"/><w:iCs w:val="1"/></w:rPr><w:t xml:space="preserve">"BARIS APP — Bikin event kompetisimu profesional, modern, dan bebas ribet. Cukup satu platform untuk semua kebutuhan: pendaftaran, penilaian, voting, tiket, dan siaran langsung. Gratis coba 3 hari. Bayar sekali, pakai selamanya."</w:t></w:r></w:p><w:p/><w:p><w:pPr><w:jc w:val="center"/></w:pPr><w:r><w:rPr><w:color w:val="0062FF"/><w:sz w:val="12"/><w:szCs w:val="12"/></w:rPr><w:t xml:space="preserve">━════════════════════════════════════════</w:t></w:r></w:p><w:p/><w:p/><w:p/><w:p/><w:p><w:pPr><w:jc w:val="center"/></w:pPr><w:r><w:rPr><w:color w:val="94A3B8"/><w:sz w:val="18"/><w:szCs w:val="18"/></w:rPr><w:t xml:space="preserve">BARIS APP — Platform Manajemen Event & Kompetisi Terpadu</w:t></w:r></w:p><w:sectPr><w:pgSz w:orient="portrait" w:w="11905.511811023622" w:h="16837.79527559055"/><w:pgMar w:top="1440" w:right="1440" w:bottom="1440" w:left="1440" w:header="720" w:footer="720" w:gutter="0"/><w:cols w:num="1" w:space="720"/></w:sectPr></w:body></w:document>
+<w:document xmlns:ve="http://schemas.openxmlformats.org/markup-compatibility/2006" xmlns:o="urn:schemas-microsoft-com:office:office" xmlns:r="http://schemas.openxmlformats.org/officeDocument/2006/relationships" xmlns:m="http://schemas.openxmlformats.org/officeDocument/2006/math" xmlns:v="urn:schemas-microsoft-com:vml" xmlns:wp="http://schemas.openxmlformats.org/drawingml/2006/wordprocessingDrawing" xmlns:w10="urn:schemas-microsoft-com:office:word" xmlns:w="http://schemas.openxmlformats.org/wordprocessingml/2006/main" xmlns:wne="http://schemas.microsoft.com/office/word/2006/wordml"><w:body><w:p/><w:p/><w:p/><w:p/><w:p/><w:p/><w:p/><w:p/><w:p><w:pPr><w:jc w:val="center"/></w:pPr><w:r><w:rPr><w:rFonts w:ascii="Calibri Light" w:hAnsi="Calibri Light" w:eastAsia="Calibri Light" w:cs="Calibri Light"/><w:color w:val="0062FF"/><w:sz w:val="64"/><w:szCs w:val="64"/><w:b w:val="1"/><w:bCs w:val="1"/></w:rPr><w:t xml:space="preserve">BARIS APP</w:t></w:r></w:p><w:p/><w:p><w:pPr><w:jc w:val="center"/></w:pPr><w:r><w:rPr><w:color w:val="64748B"/><w:sz w:val="32"/><w:szCs w:val="32"/><w:i w:val="1"/><w:iCs w:val="1"/></w:rPr><w:t xml:space="preserve">Platform Manajemen Event & Kompetisi Terpadu</w:t></w:r></w:p><w:p/><w:p/><w:p><w:pPr><w:jc w:val="center"/></w:pPr><w:r><w:rPr><w:color w:val="1E293B"/><w:sz w:val="36"/><w:szCs w:val="36"/><w:b w:val="1"/><w:bCs w:val="1"/></w:rPr><w:t xml:space="preserve">Proposal Aplikasi</w:t></w:r></w:p><w:p/><w:p/><w:p/><w:p/><w:p><w:pPr><w:jc w:val="center"/></w:pPr><w:r><w:rPr><w:color w:val="475569"/><w:sz w:val="20"/><w:szCs w:val="20"/></w:rPr><w:t xml:space="preserve">Pendaftaran Online  |  Penilaian Digital  |  Voting QRIS</w:t></w:r></w:p><w:p><w:pPr><w:jc w:val="center"/></w:pPr><w:r><w:rPr><w:color w:val="475569"/><w:sz w:val="20"/><w:szCs w:val="20"/></w:rPr><w:t xml:space="preserve">Tiket Event  |  Livestream Overlay  |  Scoreboard Publik</w:t></w:r></w:p><w:p><w:pPr><w:jc w:val="center"/></w:pPr><w:r><w:rPr><w:color w:val="475569"/><w:sz w:val="20"/><w:szCs w:val="20"/></w:rPr><w:t xml:space="preserve">Drawing  |  Champion Generator  |  Subdomain Kustom</w:t></w:r></w:p><w:p/><w:p/><w:p/><w:p/><w:p><w:pPr><w:jc w:val="center"/></w:pPr><w:r><w:rPr><w:color w:val="94A3B8"/><w:sz w:val="20"/><w:szCs w:val="20"/></w:rPr><w:t xml:space="preserve">20 July 2026</w:t></w:r></w:p><w:p><w:r><w:br w:type="page"/></w:r></w:p><w:p><w:pPr><w:pStyle w:val="Heading1"/></w:pPr><w:bookmarkStart w:id="0" w:name="_Toc0"/><w:r><w:t>1. Masalah yang Kami Selesaikan</w:t></w:r><w:bookmarkEnd w:id="0"/></w:p><w:p><w:pPr/><w:r><w:rPr><w:rStyle w:val="p"/></w:rPr><w:t xml:space="preserve">Platform tradisional dalam penyelenggaraan event kompetisi masih menggunakan sistem manual yang merepotkan. BARIS APP hadir sebagai solusi digital all-in-one.</w:t></w:r></w:p><w:tbl><w:tblGrid><w:gridCol w:w="3000" w:type="dxa"/><w:gridCol w:w="3000" w:type="dxa"/><w:gridCol w:w="3000" w:type="dxa"/></w:tblGrid><w:tblPr><w:tblW w:w="0" w:type="auto"/><w:tblLayout w:type="autofit"/><w:tblCellMar><w:top w:w="60" w:type="dxa"/><w:left w:w="60" w:type="dxa"/><w:right w:w="60" w:type="dxa"/><w:bottom w:w="60" w:type="dxa"/></w:tblCellMar><w:tblBorders><w:top w:val="single" w:sz="6" w:color="B0BEC5"/><w:left w:val="single" w:sz="6" w:color="B0BEC5"/><w:right w:val="single" w:sz="6" w:color="B0BEC5"/><w:bottom w:val="single" w:sz="6" w:color="B0BEC5"/><w:insideH w:val="single" w:sz="6" w:color="B0BEC5"/><w:insideV w:val="single" w:sz="6" w:color="B0BEC5"/></w:tblBorders></w:tblPr><w:tr><w:trPr/><w:tc><w:tcPr><w:tcW w:w="3000" w:type="dxa"/><w:shd w:val="clear" w:fill="0062FF"/><w:noWrap/></w:tcPr><w:p><w:pPr/><w:r><w:rPr><w:color w:val="FFFFFF"/><w:sz w:val="20"/><w:szCs w:val="20"/><w:b w:val="1"/><w:bCs w:val="1"/></w:rPr><w:t xml:space="preserve">Masalah</w:t></w:r></w:p></w:tc><w:tc><w:tcPr><w:tcW w:w="3000" w:type="dxa"/><w:shd w:val="clear" w:fill="0062FF"/><w:noWrap/></w:tcPr><w:p><w:pPr/><w:r><w:rPr><w:color w:val="FFFFFF"/><w:sz w:val="20"/><w:szCs w:val="20"/><w:b w:val="1"/><w:bCs w:val="1"/></w:rPr><w:t xml:space="preserve">Dampak</w:t></w:r></w:p></w:tc><w:tc><w:tcPr><w:tcW w:w="3000" w:type="dxa"/><w:shd w:val="clear" w:fill="0062FF"/><w:noWrap/></w:tcPr><w:p><w:pPr/><w:r><w:rPr><w:color w:val="FFFFFF"/><w:sz w:val="20"/><w:szCs w:val="20"/><w:b w:val="1"/><w:bCs w:val="1"/></w:rPr><w:t xml:space="preserve">Solusi BARIS APP</w:t></w:r></w:p></w:tc></w:tr><w:tr><w:trPr/><w:tc><w:tcPr><w:tcW w:w="3000" w:type="dxa"/><w:noWrap/></w:tcPr><w:p><w:pPr/><w:r><w:rPr><w:sz w:val="20"/><w:szCs w:val="20"/></w:rPr><w:t xml:space="preserve">Pendaftaran manual & kertas</w:t></w:r></w:p></w:tc><w:tc><w:tcPr><w:tcW w:w="3000" w:type="dxa"/><w:noWrap/></w:tcPr><w:p><w:pPr/><w:r><w:rPr><w:sz w:val="20"/><w:szCs w:val="20"/></w:rPr><w:t xml:space="preserve">Data hilang, antrean panjang</w:t></w:r></w:p></w:tc><w:tc><w:tcPr><w:tcW w:w="3000" w:type="dxa"/><w:noWrap/></w:tcPr><w:p><w:pPr/><w:r><w:rPr><w:sz w:val="20"/><w:szCs w:val="20"/></w:rPr><w:t xml:space="preserve">Pendaftaran online + magic link</w:t></w:r></w:p></w:tc></w:tr><w:tr><w:trPr/><w:tc><w:tcPr><w:tcW w:w="3000" w:type="dxa"/><w:noWrap/></w:tcPr><w:p><w:pPr/><w:r><w:rPr><w:sz w:val="20"/><w:szCs w:val="20"/></w:rPr><w:t xml:space="preserve">Penilaian juri pakai kertas</w:t></w:r></w:p></w:tc><w:tc><w:tcPr><w:tcW w:w="3000" w:type="dxa"/><w:noWrap/></w:tcPr><w:p><w:pPr/><w:r><w:rPr><w:sz w:val="20"/><w:szCs w:val="20"/></w:rPr><w:t xml:space="preserve">Rekap lama, rawan manipulasi</w:t></w:r></w:p></w:tc><w:tc><w:tcPr><w:tcW w:w="3000" w:type="dxa"/><w:noWrap/></w:tcPr><w:p><w:pPr/><w:r><w:rPr><w:sz w:val="20"/><w:szCs w:val="20"/></w:rPr><w:t xml:space="preserve">Scoring digital dari HP juri</w:t></w:r></w:p></w:tc></w:tr><w:tr><w:trPr/><w:tc><w:tcPr><w:tcW w:w="3000" w:type="dxa"/><w:noWrap/></w:tcPr><w:p><w:pPr/><w:r><w:rPr><w:sz w:val="20"/><w:szCs w:val="20"/></w:rPr><w:t xml:space="preserve">Voting penonton ribet</w:t></w:r></w:p></w:tc><w:tc><w:tcPr><w:tcW w:w="3000" w:type="dxa"/><w:noWrap/></w:tcPr><w:p><w:pPr/><w:r><w:rPr><w:sz w:val="20"/><w:szCs w:val="20"/></w:rPr><w:t xml:space="preserve">Potensi donasi hilang</w:t></w:r></w:p></w:tc><w:tc><w:tcPr><w:tcW w:w="3000" w:type="dxa"/><w:noWrap/></w:tcPr><w:p><w:pPr/><w:r><w:rPr><w:sz w:val="20"/><w:szCs w:val="20"/></w:rPr><w:t xml:space="preserve">QRIS voting - scan, bayar, langsung</w:t></w:r></w:p></w:tc></w:tr><w:tr><w:trPr/><w:tc><w:tcPr><w:tcW w:w="3000" w:type="dxa"/><w:noWrap/></w:tcPr><w:p><w:pPr/><w:r><w:rPr><w:sz w:val="20"/><w:szCs w:val="20"/></w:rPr><w:t xml:space="preserve">Tiket event antre fisik</w:t></w:r></w:p></w:tc><w:tc><w:tcPr><w:tcW w:w="3000" w:type="dxa"/><w:noWrap/></w:tcPr><w:p><w:pPr/><w:r><w:rPr><w:sz w:val="20"/><w:szCs w:val="20"/></w:rPr><w:t xml:space="preserve">Pemalsuan tiket, antre</w:t></w:r></w:p></w:tc><w:tc><w:tcPr><w:tcW w:w="3000" w:type="dxa"/><w:noWrap/></w:tcPr><w:p><w:pPr/><w:r><w:rPr><w:sz w:val="20"/><w:szCs w:val="20"/></w:rPr><w:t xml:space="preserve">QR Code tiket + scan check-in</w:t></w:r></w:p></w:tc></w:tr><w:tr><w:trPr/><w:tc><w:tcPr><w:tcW w:w="3000" w:type="dxa"/><w:noWrap/></w:tcPr><w:p><w:pPr/><w:r><w:rPr><w:sz w:val="20"/><w:szCs w:val="20"/></w:rPr><w:t xml:space="preserve">Papan skor manual</w:t></w:r></w:p></w:tc><w:tc><w:tcPr><w:tcW w:w="3000" w:type="dxa"/><w:noWrap/></w:tcPr><w:p><w:pPr/><w:r><w:rPr><w:sz w:val="20"/><w:szCs w:val="20"/></w:rPr><w:t xml:space="preserve">Update lambat</w:t></w:r></w:p></w:tc><w:tc><w:tcPr><w:tcW w:w="3000" w:type="dxa"/><w:noWrap/></w:tcPr><w:p><w:pPr/><w:r><w:rPr><w:sz w:val="20"/><w:szCs w:val="20"/></w:rPr><w:t xml:space="preserve">Overlay OBS + scoreboard publik</w:t></w:r></w:p></w:tc></w:tr><w:tr><w:trPr/><w:tc><w:tcPr><w:tcW w:w="3000" w:type="dxa"/><w:noWrap/></w:tcPr><w:p><w:pPr/><w:r><w:rPr><w:sz w:val="20"/><w:szCs w:val="20"/></w:rPr><w:t xml:space="preserve">Pengumuman juara lambat</w:t></w:r></w:p></w:tc><w:tc><w:tcPr><w:tcW w:w="3000" w:type="dxa"/><w:noWrap/></w:tcPr><w:p><w:pPr/><w:r><w:rPr><w:sz w:val="20"/><w:szCs w:val="20"/></w:rPr><w:t xml:space="preserve">Peserta menunggu</w:t></w:r></w:p></w:tc><w:tc><w:tcPr><w:tcW w:w="3000" w:type="dxa"/><w:noWrap/></w:tcPr><w:p><w:pPr/><w:r><w:rPr><w:sz w:val="20"/><w:szCs w:val="20"/></w:rPr><w:t xml:space="preserve">Champion generator otomatis</w:t></w:r></w:p></w:tc></w:tr><w:tr><w:trPr/><w:tc><w:tcPr><w:tcW w:w="3000" w:type="dxa"/><w:noWrap/></w:tcPr><w:p><w:pPr/><w:r><w:rPr><w:sz w:val="20"/><w:szCs w:val="20"/></w:rPr><w:t xml:space="preserve">Biaya platform mahal</w:t></w:r></w:p></w:tc><w:tc><w:tcPr><w:tcW w:w="3000" w:type="dxa"/><w:noWrap/></w:tcPr><w:p><w:pPr/><w:r><w:rPr><w:sz w:val="20"/><w:szCs w:val="20"/></w:rPr><w:t xml:space="preserve">Ribuan per bulan</w:t></w:r></w:p></w:tc><w:tc><w:tcPr><w:tcW w:w="3000" w:type="dxa"/><w:noWrap/></w:tcPr><w:p><w:pPr/><w:r><w:rPr><w:sz w:val="20"/><w:szCs w:val="20"/></w:rPr><w:t xml:space="preserve">Bayar sekali, pakai selamanya</w:t></w:r></w:p></w:tc></w:tr></w:tbl><w:p/><w:tbl><w:tblGrid><w:gridCol w:w="10000" w:type="dxa"/></w:tblGrid><w:tblPr><w:tblW w:w="0" w:type="auto"/><w:tblLayout w:type="autofit"/><w:tblCellMar><w:top w:w="150" w:type="dxa"/><w:left w:w="150" w:type="dxa"/><w:right w:w="150" w:type="dxa"/><w:bottom w:w="150" w:type="dxa"/></w:tblCellMar><w:tblBorders><w:top w:val="single" w:sz="4" w:color="B0BEC5"/><w:left w:val="single" w:sz="4" w:color="B0BEC5"/><w:right w:val="single" w:sz="4" w:color="B0BEC5"/><w:bottom w:val="single" w:sz="4" w:color="B0BEC5"/><w:insideH w:val="single" w:sz="4" w:color="B0BEC5"/><w:insideV w:val="single" w:sz="4" w:color="B0BEC5"/></w:tblBorders></w:tblPr><w:tr><w:trPr/><w:tc><w:tcPr><w:tcW w:w="10000" w:type="dxa"/><w:shd w:val="clear" w:fill="F1F5F9"/><w:noWrap/></w:tcPr><w:p/><w:p/><w:p><w:pPr><w:jc w:val="center"/></w:pPr><w:r><w:rPr><w:color w:val="94A3B8"/><w:sz w:val="24"/><w:szCs w:val="24"/><w:b w:val="1"/><w:bCs w:val="1"/></w:rPr><w:t xml:space="preserve">[ SCREENSHOT_1 - Halaman pendaftaran event ]</w:t></w:r></w:p><w:p><w:pPr><w:jc w:val="center"/></w:pPr><w:r><w:rPr><w:color w:val="B0BEC5"/><w:sz w:val="18"/><w:szCs w:val="18"/><w:i w:val="1"/><w:iCs w:val="1"/></w:rPr><w:t xml:space="preserve">(Tempatkan screenshot di sini, hapus border table setelahnya)</w:t></w:r></w:p><w:p/><w:p/></w:tc></w:tr></w:tbl><w:p/><w:p><w:r><w:br w:type="page"/></w:r></w:p><w:p><w:pPr><w:pStyle w:val="Heading1"/></w:pPr><w:bookmarkStart w:id="1" w:name="_Toc1"/><w:r><w:t>2. Kenapa BARIS APP?</w:t></w:r><w:bookmarkEnd w:id="1"/></w:p><w:p><w:pPr><w:pStyle w:val="Heading2"/></w:pPr><w:bookmarkStart w:id="2" w:name="_Toc2"/><w:r><w:t>All-in-One Platform</w:t></w:r><w:bookmarkEnd w:id="2"/></w:p><w:p><w:pPr/><w:r><w:rPr><w:rStyle w:val="p"/></w:rPr><w:t xml:space="preserve">Tidak perlu 5 aplikasi berbeda. Cukup BARIS APP untuk semuanya:</w:t></w:r></w:p><w:tbl><w:tblGrid><w:gridCol w:w="3000" w:type="dxa"/><w:gridCol w:w="3000" w:type="dxa"/></w:tblGrid><w:tblPr><w:tblW w:w="0" w:type="auto"/><w:tblLayout w:type="autofit"/><w:tblCellMar><w:top w:w="60" w:type="dxa"/><w:left w:w="60" w:type="dxa"/><w:right w:w="60" w:type="dxa"/><w:bottom w:w="60" w:type="dxa"/></w:tblCellMar><w:tblBorders><w:top w:val="single" w:sz="6" w:color="B0BEC5"/><w:left w:val="single" w:sz="6" w:color="B0BEC5"/><w:right w:val="single" w:sz="6" w:color="B0BEC5"/><w:bottom w:val="single" w:sz="6" w:color="B0BEC5"/><w:insideH w:val="single" w:sz="6" w:color="B0BEC5"/><w:insideV w:val="single" w:sz="6" w:color="B0BEC5"/></w:tblBorders></w:tblPr><w:tr><w:trPr/><w:tc><w:tcPr><w:tcW w:w="3000" w:type="dxa"/><w:shd w:val="clear" w:fill="0062FF"/><w:noWrap/></w:tcPr><w:p><w:pPr/><w:r><w:rPr><w:color w:val="FFFFFF"/><w:sz w:val="20"/><w:szCs w:val="20"/><w:b w:val="1"/><w:bCs w:val="1"/></w:rPr><w:t xml:space="preserve">Fitur</w:t></w:r></w:p></w:tc><w:tc><w:tcPr><w:tcW w:w="3000" w:type="dxa"/><w:shd w:val="clear" w:fill="0062FF"/><w:noWrap/></w:tcPr><w:p><w:pPr/><w:r><w:rPr><w:color w:val="FFFFFF"/><w:sz w:val="20"/><w:szCs w:val="20"/><w:b w:val="1"/><w:bCs w:val="1"/></w:rPr><w:t xml:space="preserve">Manfaat</w:t></w:r></w:p></w:tc></w:tr><w:tr><w:trPr/><w:tc><w:tcPr><w:tcW w:w="3000" w:type="dxa"/><w:noWrap/></w:tcPr><w:p><w:pPr/><w:r><w:rPr><w:sz w:val="20"/><w:szCs w:val="20"/></w:rPr><w:t xml:space="preserve">Landing Page Event</w:t></w:r></w:p></w:tc><w:tc><w:tcPr><w:tcW w:w="3000" w:type="dxa"/><w:noWrap/></w:tcPr><w:p><w:pPr/><w:r><w:rPr><w:sz w:val="20"/><w:szCs w:val="20"/></w:rPr><w:t xml:space="preserve">Halaman publik otomatis dengan tema kustom</w:t></w:r></w:p></w:tc></w:tr><w:tr><w:trPr/><w:tc><w:tcPr><w:tcW w:w="3000" w:type="dxa"/><w:noWrap/></w:tcPr><w:p><w:pPr/><w:r><w:rPr><w:sz w:val="20"/><w:szCs w:val="20"/></w:rPr><w:t xml:space="preserve">Pendaftaran Online</w:t></w:r></w:p></w:tc><w:tc><w:tcPr><w:tcW w:w="3000" w:type="dxa"/><w:noWrap/></w:tcPr><w:p><w:pPr/><w:r><w:rPr><w:sz w:val="20"/><w:szCs w:val="20"/></w:rPr><w:t xml:space="preserve">Via magic link, tanpa buat akun</w:t></w:r></w:p></w:tc></w:tr><w:tr><w:trPr/><w:tc><w:tcPr><w:tcW w:w="3000" w:type="dxa"/><w:noWrap/></w:tcPr><w:p><w:pPr/><w:r><w:rPr><w:sz w:val="20"/><w:szCs w:val="20"/></w:rPr><w:t xml:space="preserve">Manajemen Peserta</w:t></w:r></w:p></w:tc><w:tc><w:tcPr><w:tcW w:w="3000" w:type="dxa"/><w:noWrap/></w:tcPr><w:p><w:pPr/><w:r><w:rPr><w:sz w:val="20"/><w:szCs w:val="20"/></w:rPr><w:t xml:space="preserve">Data tim, pelatih, danton, upload berkas</w:t></w:r></w:p></w:tc></w:tr><w:tr><w:trPr/><w:tc><w:tcPr><w:tcW w:w="3000" w:type="dxa"/><w:noWrap/></w:tcPr><w:p><w:pPr/><w:r><w:rPr><w:sz w:val="20"/><w:szCs w:val="20"/></w:rPr><w:t xml:space="preserve">Penilaian Digital</w:t></w:r></w:p></w:tc><w:tc><w:tcPr><w:tcW w:w="3000" w:type="dxa"/><w:noWrap/></w:tcPr><w:p><w:pPr/><w:r><w:rPr><w:sz w:val="20"/><w:szCs w:val="20"/></w:rPr><w:t xml:space="preserve">Juri nilai via HP, skor otomatis</w:t></w:r></w:p></w:tc></w:tr><w:tr><w:trPr/><w:tc><w:tcPr><w:tcW w:w="3000" w:type="dxa"/><w:noWrap/></w:tcPr><w:p><w:pPr/><w:r><w:rPr><w:sz w:val="20"/><w:szCs w:val="20"/></w:rPr><w:t xml:space="preserve">Champion Generator</w:t></w:r></w:p></w:tc><w:tc><w:tcPr><w:tcW w:w="3000" w:type="dxa"/><w:noWrap/></w:tcPr><w:p><w:pPr/><w:r><w:rPr><w:sz w:val="20"/><w:szCs w:val="20"/></w:rPr><w:t xml:space="preserve">Juara dari akumulasi nilai + tiebreak</w:t></w:r></w:p></w:tc></w:tr><w:tr><w:trPr/><w:tc><w:tcPr><w:tcW w:w="3000" w:type="dxa"/><w:noWrap/></w:tcPr><w:p><w:pPr/><w:r><w:rPr><w:sz w:val="20"/><w:szCs w:val="20"/></w:rPr><w:t xml:space="preserve">Vote Berbayar QRIS</w:t></w:r></w:p></w:tc><w:tc><w:tcPr><w:tcW w:w="3000" w:type="dxa"/><w:noWrap/></w:tcPr><w:p><w:pPr/><w:r><w:rPr><w:sz w:val="20"/><w:szCs w:val="20"/></w:rPr><w:t xml:space="preserve">Dana masuk real-time via scan QRIS</w:t></w:r></w:p></w:tc></w:tr><w:tr><w:trPr/><w:tc><w:tcPr><w:tcW w:w="3000" w:type="dxa"/><w:noWrap/></w:tcPr><w:p><w:pPr/><w:r><w:rPr><w:sz w:val="20"/><w:szCs w:val="20"/></w:rPr><w:t xml:space="preserve">Tiket Event QRIS</w:t></w:r></w:p></w:tc><w:tc><w:tcPr><w:tcW w:w="3000" w:type="dxa"/><w:noWrap/></w:tcPr><w:p><w:pPr/><w:r><w:rPr><w:sz w:val="20"/><w:szCs w:val="20"/></w:rPr><w:t xml:space="preserve">Jual tiket online + QR Code check-in</w:t></w:r></w:p></w:tc></w:tr><w:tr><w:trPr/><w:tc><w:tcPr><w:tcW w:w="3000" w:type="dxa"/><w:noWrap/></w:tcPr><w:p><w:pPr/><w:r><w:rPr><w:sz w:val="20"/><w:szCs w:val="20"/></w:rPr><w:t xml:space="preserve">Drawing / Undian</w:t></w:r></w:p></w:tc><w:tc><w:tcPr><w:tcW w:w="3000" w:type="dxa"/><w:noWrap/></w:tcPr><w:p><w:pPr/><w:r><w:rPr><w:sz w:val="20"/><w:szCs w:val="20"/></w:rPr><w:t xml:space="preserve">Layar spin interaktif</w:t></w:r></w:p></w:tc></w:tr><w:tr><w:trPr/><w:tc><w:tcPr><w:tcW w:w="3000" w:type="dxa"/><w:noWrap/></w:tcPr><w:p><w:pPr/><w:r><w:rPr><w:sz w:val="20"/><w:szCs w:val="20"/></w:rPr><w:t xml:space="preserve">Livestream Overlay</w:t></w:r></w:p></w:tc><w:tc><w:tcPr><w:tcW w:w="3000" w:type="dxa"/><w:noWrap/></w:tcPr><w:p><w:pPr/><w:r><w:rPr><w:sz w:val="20"/><w:szCs w:val="20"/></w:rPr><w:t xml:space="preserve">Tampilan OBS profesional</w:t></w:r></w:p></w:tc></w:tr><w:tr><w:trPr/><w:tc><w:tcPr><w:tcW w:w="3000" w:type="dxa"/><w:noWrap/></w:tcPr><w:p><w:pPr/><w:r><w:rPr><w:sz w:val="20"/><w:szCs w:val="20"/></w:rPr><w:t xml:space="preserve">Live Scoreboard</w:t></w:r></w:p></w:tc><w:tc><w:tcPr><w:tcW w:w="3000" w:type="dxa"/><w:noWrap/></w:tcPr><w:p><w:pPr/><w:r><w:rPr><w:sz w:val="20"/><w:szCs w:val="20"/></w:rPr><w:t xml:space="preserve">Papan skor real-time</w:t></w:r></w:p></w:tc></w:tr><w:tr><w:trPr/><w:tc><w:tcPr><w:tcW w:w="3000" w:type="dxa"/><w:noWrap/></w:tcPr><w:p><w:pPr/><w:r><w:rPr><w:sz w:val="20"/><w:szCs w:val="20"/></w:rPr><w:t xml:space="preserve">Sponsor & Tenant</w:t></w:r></w:p></w:tc><w:tc><w:tcPr><w:tcW w:w="3000" w:type="dxa"/><w:noWrap/></w:tcPr><w:p><w:pPr/><w:r><w:rPr><w:sz w:val="20"/><w:szCs w:val="20"/></w:rPr><w:t xml:space="preserve">Kelola partner event</w:t></w:r></w:p></w:tc></w:tr><w:tr><w:trPr/><w:tc><w:tcPr><w:tcW w:w="3000" w:type="dxa"/><w:noWrap/></w:tcPr><w:p><w:pPr/><w:r><w:rPr><w:sz w:val="20"/><w:szCs w:val="20"/></w:rPr><w:t xml:space="preserve">Subdomain Sendiri</w:t></w:r></w:p></w:tc><w:tc><w:tcPr><w:tcW w:w="3000" w:type="dxa"/><w:noWrap/></w:tcPr><w:p><w:pPr/><w:r><w:rPr><w:sz w:val="20"/><w:szCs w:val="20"/></w:rPr><w:t xml:space="preserve">nama-event.berbaris.app</w:t></w:r></w:p></w:tc></w:tr></w:tbl><w:p/><w:tbl><w:tblGrid><w:gridCol w:w="10000" w:type="dxa"/></w:tblGrid><w:tblPr><w:tblW w:w="0" w:type="auto"/><w:tblLayout w:type="autofit"/><w:tblCellMar><w:top w:w="150" w:type="dxa"/><w:left w:w="150" w:type="dxa"/><w:right w:w="150" w:type="dxa"/><w:bottom w:w="150" w:type="dxa"/></w:tblCellMar><w:tblBorders><w:top w:val="single" w:sz="4" w:color="B0BEC5"/><w:left w:val="single" w:sz="4" w:color="B0BEC5"/><w:right w:val="single" w:sz="4" w:color="B0BEC5"/><w:bottom w:val="single" w:sz="4" w:color="B0BEC5"/><w:insideH w:val="single" w:sz="4" w:color="B0BEC5"/><w:insideV w:val="single" w:sz="4" w:color="B0BEC5"/></w:tblBorders></w:tblPr><w:tr><w:trPr/><w:tc><w:tcPr><w:tcW w:w="10000" w:type="dxa"/><w:shd w:val="clear" w:fill="F1F5F9"/><w:noWrap/></w:tcPr><w:p/><w:p/><w:p><w:pPr><w:jc w:val="center"/></w:pPr><w:r><w:rPr><w:color w:val="94A3B8"/><w:sz w:val="24"/><w:szCs w:val="24"/><w:b w:val="1"/><w:bCs w:val="1"/></w:rPr><w:t xml:space="preserve">[ SCREENSHOT_2 - Dashboard eventner ]</w:t></w:r></w:p><w:p><w:pPr><w:jc w:val="center"/></w:pPr><w:r><w:rPr><w:color w:val="B0BEC5"/><w:sz w:val="18"/><w:szCs w:val="18"/><w:i w:val="1"/><w:iCs w:val="1"/></w:rPr><w:t xml:space="preserve">(Tempatkan screenshot di sini, hapus border table setelahnya)</w:t></w:r></w:p><w:p/><w:p/></w:tc></w:tr></w:tbl><w:p/><w:p><w:pPr><w:pStyle w:val="Heading2"/></w:pPr><w:bookmarkStart w:id="3" w:name="_Toc3"/><w:r><w:t>Mudah Digunakan</w:t></w:r><w:bookmarkEnd w:id="3"/></w:p><w:p><w:pPr/><w:r><w:rPr><w:rStyle w:val="p"/></w:rPr><w:t xml:space="preserve">  Peserta: Tidak perlu daftar akun - cukup klik magic link dari email</w:t></w:r></w:p><w:p><w:pPr/><w:r><w:rPr><w:rStyle w:val="p"/></w:rPr><w:t xml:space="preserve">  Juri: Buka link, nilai langsung, simpan - dari HP mana pun</w:t></w:r></w:p><w:p><w:pPr/><w:r><w:rPr><w:rStyle w:val="p"/></w:rPr><w:t xml:space="preserve">  Panitia: Satu dashboard untuk semua kontrol event</w:t></w:r></w:p><w:p><w:pPr/><w:r><w:rPr><w:rStyle w:val="p"/></w:rPr><w:t xml:space="preserve">  Penonton: Scan QRIS untuk vote, lihat scoreboard real-time</w:t></w:r></w:p><w:p/><w:tbl><w:tblGrid><w:gridCol w:w="10000" w:type="dxa"/></w:tblGrid><w:tblPr><w:tblW w:w="0" w:type="auto"/><w:tblLayout w:type="autofit"/><w:tblCellMar><w:top w:w="150" w:type="dxa"/><w:left w:w="150" w:type="dxa"/><w:right w:w="150" w:type="dxa"/><w:bottom w:w="150" w:type="dxa"/></w:tblCellMar><w:tblBorders><w:top w:val="single" w:sz="4" w:color="B0BEC5"/><w:left w:val="single" w:sz="4" w:color="B0BEC5"/><w:right w:val="single" w:sz="4" w:color="B0BEC5"/><w:bottom w:val="single" w:sz="4" w:color="B0BEC5"/><w:insideH w:val="single" w:sz="4" w:color="B0BEC5"/><w:insideV w:val="single" w:sz="4" w:color="B0BEC5"/></w:tblBorders></w:tblPr><w:tr><w:trPr/><w:tc><w:tcPr><w:tcW w:w="10000" w:type="dxa"/><w:shd w:val="clear" w:fill="F1F5F9"/><w:noWrap/></w:tcPr><w:p/><w:p/><w:p><w:pPr><w:jc w:val="center"/></w:pPr><w:r><w:rPr><w:color w:val="94A3B8"/><w:sz w:val="24"/><w:szCs w:val="24"/><w:b w:val="1"/><w:bCs w:val="1"/></w:rPr><w:t xml:space="preserve">[ SCREENSHOT_3 - Halaman vote publik ]</w:t></w:r></w:p><w:p><w:pPr><w:jc w:val="center"/></w:pPr><w:r><w:rPr><w:color w:val="B0BEC5"/><w:sz w:val="18"/><w:szCs w:val="18"/><w:i w:val="1"/><w:iCs w:val="1"/></w:rPr><w:t xml:space="preserve">(Tempatkan screenshot di sini, hapus border table setelahnya)</w:t></w:r></w:p><w:p/><w:p/></w:tc></w:tr></w:tbl><w:p/><w:p><w:r><w:br w:type="page"/></w:r></w:p><w:p><w:pPr><w:pStyle w:val="Heading2"/></w:pPr><w:bookmarkStart w:id="4" w:name="_Toc4"/><w:r><w:t>Harga Terjangkau</w:t></w:r><w:bookmarkEnd w:id="4"/></w:p><w:p><w:pPr><w:spacing w:after="200"/></w:pPr><w:r><w:rPr><w:color w:val="0062FF"/><w:sz w:val="24"/><w:szCs w:val="24"/><w:b w:val="1"/><w:bCs w:val="1"/></w:rPr><w:t xml:space="preserve">Bayar SEKALI - 1 event bisa melayani ribuan peserta, puluhan juri, ratusan vote - TANPA BIAYA TAMBAHAN.</w:t></w:r></w:p><w:tbl><w:tblGrid><w:gridCol w:w="3000" w:type="dxa"/><w:gridCol w:w="3000" w:type="dxa"/><w:gridCol w:w="3000" w:type="dxa"/></w:tblGrid><w:tblPr><w:tblW w:w="0" w:type="auto"/><w:tblLayout w:type="autofit"/><w:tblCellMar><w:top w:w="60" w:type="dxa"/><w:left w:w="60" w:type="dxa"/><w:right w:w="60" w:type="dxa"/><w:bottom w:w="60" w:type="dxa"/></w:tblCellMar><w:tblBorders><w:top w:val="single" w:sz="6" w:color="B0BEC5"/><w:left w:val="single" w:sz="6" w:color="B0BEC5"/><w:right w:val="single" w:sz="6" w:color="B0BEC5"/><w:bottom w:val="single" w:sz="6" w:color="B0BEC5"/><w:insideH w:val="single" w:sz="6" w:color="B0BEC5"/><w:insideV w:val="single" w:sz="6" w:color="B0BEC5"/></w:tblBorders></w:tblPr><w:tr><w:trPr/><w:tc><w:tcPr><w:tcW w:w="3000" w:type="dxa"/><w:shd w:val="clear" w:fill="0062FF"/><w:noWrap/></w:tcPr><w:p><w:pPr/><w:r><w:rPr><w:color w:val="FFFFFF"/><w:sz w:val="20"/><w:szCs w:val="20"/><w:b w:val="1"/><w:bCs w:val="1"/></w:rPr><w:t xml:space="preserve">Paket</w:t></w:r></w:p></w:tc><w:tc><w:tcPr><w:tcW w:w="3000" w:type="dxa"/><w:shd w:val="clear" w:fill="0062FF"/><w:noWrap/></w:tcPr><w:p><w:pPr/><w:r><w:rPr><w:color w:val="FFFFFF"/><w:sz w:val="20"/><w:szCs w:val="20"/><w:b w:val="1"/><w:bCs w:val="1"/></w:rPr><w:t xml:space="preserve">Harga</w:t></w:r></w:p></w:tc><w:tc><w:tcPr><w:tcW w:w="3000" w:type="dxa"/><w:shd w:val="clear" w:fill="0062FF"/><w:noWrap/></w:tcPr><w:p><w:pPr/><w:r><w:rPr><w:color w:val="FFFFFF"/><w:sz w:val="20"/><w:szCs w:val="20"/><w:b w:val="1"/><w:bCs w:val="1"/></w:rPr><w:t xml:space="preserve">Keterangan</w:t></w:r></w:p></w:tc></w:tr><w:tr><w:trPr/><w:tc><w:tcPr><w:tcW w:w="3000" w:type="dxa"/><w:noWrap/></w:tcPr><w:p><w:pPr/><w:r><w:rPr><w:sz w:val="20"/><w:szCs w:val="20"/></w:rPr><w:t xml:space="preserve">Gratis</w:t></w:r></w:p></w:tc><w:tc><w:tcPr><w:tcW w:w="3000" w:type="dxa"/><w:noWrap/></w:tcPr><w:p><w:pPr/><w:r><w:rPr><w:sz w:val="20"/><w:szCs w:val="20"/></w:rPr><w:t xml:space="preserve">Rp 0</w:t></w:r></w:p></w:tc><w:tc><w:tcPr><w:tcW w:w="3000" w:type="dxa"/><w:noWrap/></w:tcPr><w:p><w:pPr/><w:r><w:rPr><w:sz w:val="20"/><w:szCs w:val="20"/></w:rPr><w:t xml:space="preserve">Trial 3 hari - eksplorasi semua fitur premium</w:t></w:r></w:p></w:tc></w:tr><w:tr><w:trPr/><w:tc><w:tcPr><w:tcW w:w="3000" w:type="dxa"/><w:noWrap/></w:tcPr><w:p><w:pPr/><w:r><w:rPr><w:sz w:val="20"/><w:szCs w:val="20"/></w:rPr><w:t xml:space="preserve">Berbayar</w:t></w:r></w:p></w:tc><w:tc><w:tcPr><w:tcW w:w="3000" w:type="dxa"/><w:noWrap/></w:tcPr><w:p><w:pPr/><w:r><w:rPr><w:sz w:val="20"/><w:szCs w:val="20"/></w:rPr><w:t xml:space="preserve">Rp 50.000</w:t></w:r></w:p></w:tc><w:tc><w:tcPr><w:tcW w:w="3000" w:type="dxa"/><w:noWrap/></w:tcPr><w:p><w:pPr/><w:r><w:rPr><w:sz w:val="20"/><w:szCs w:val="20"/></w:rPr><w:t xml:space="preserve">Sekali bayar - semua fitur terbuka permanen</w:t></w:r></w:p></w:tc></w:tr></w:tbl><w:p/><w:tbl><w:tblGrid><w:gridCol w:w="10000" w:type="dxa"/></w:tblGrid><w:tblPr><w:tblW w:w="0" w:type="auto"/><w:tblLayout w:type="autofit"/><w:tblCellMar><w:top w:w="150" w:type="dxa"/><w:left w:w="150" w:type="dxa"/><w:right w:w="150" w:type="dxa"/><w:bottom w:w="150" w:type="dxa"/></w:tblCellMar><w:tblBorders><w:top w:val="single" w:sz="4" w:color="B0BEC5"/><w:left w:val="single" w:sz="4" w:color="B0BEC5"/><w:right w:val="single" w:sz="4" w:color="B0BEC5"/><w:bottom w:val="single" w:sz="4" w:color="B0BEC5"/><w:insideH w:val="single" w:sz="4" w:color="B0BEC5"/><w:insideV w:val="single" w:sz="4" w:color="B0BEC5"/></w:tblBorders></w:tblPr><w:tr><w:trPr/><w:tc><w:tcPr><w:tcW w:w="10000" w:type="dxa"/><w:shd w:val="clear" w:fill="F1F5F9"/><w:noWrap/></w:tcPr><w:p/><w:p/><w:p><w:pPr><w:jc w:val="center"/></w:pPr><w:r><w:rPr><w:color w:val="94A3B8"/><w:sz w:val="24"/><w:szCs w:val="24"/><w:b w:val="1"/><w:bCs w:val="1"/></w:rPr><w:t xml:space="preserve">[ SCREENSHOT_4 - Halaman pembayaran QRIS ]</w:t></w:r></w:p><w:p><w:pPr><w:jc w:val="center"/></w:pPr><w:r><w:rPr><w:color w:val="B0BEC5"/><w:sz w:val="18"/><w:szCs w:val="18"/><w:i w:val="1"/><w:iCs w:val="1"/></w:rPr><w:t xml:space="preserve">(Tempatkan screenshot di sini, hapus border table setelahnya)</w:t></w:r></w:p><w:p/><w:p/></w:tc></w:tr></w:tbl><w:p/><w:p><w:pPr><w:pStyle w:val="Heading2"/></w:pPr><w:bookmarkStart w:id="5" w:name="_Toc5"/><w:r><w:t>Branding Profesional</w:t></w:r><w:bookmarkEnd w:id="5"/></w:p><w:p><w:pPr/><w:r><w:rPr><w:rStyle w:val="p"/></w:rPr><w:t xml:space="preserve">  Subdomain kustom: kejurcab-cianjur.berbaris.app</w:t></w:r></w:p><w:p><w:pPr/><w:r><w:rPr><w:rStyle w:val="p"/></w:rPr><w:t xml:space="preserve">  Tema warna: Sesuaikan dengan warna acara Anda</w:t></w:r></w:p><w:p><w:pPr/><w:r><w:rPr><w:rStyle w:val="p"/></w:rPr><w:t xml:space="preserve">  Logo & Poster: Upload logo dan poster event</w:t></w:r></w:p><w:p><w:pPr/><w:r><w:rPr><w:rStyle w:val="p"/></w:rPr><w:t xml:space="preserve">  Font kustom: Pilih font untuk halaman publik</w:t></w:r></w:p><w:p><w:pPr/><w:r><w:rPr><w:rStyle w:val="p"/></w:rPr><w:t xml:space="preserve">  Overlay OBS: Tampilan profesional untuk siaran langsung</w:t></w:r></w:p><w:p/><w:tbl><w:tblGrid><w:gridCol w:w="10000" w:type="dxa"/></w:tblGrid><w:tblPr><w:tblW w:w="0" w:type="auto"/><w:tblLayout w:type="autofit"/><w:tblCellMar><w:top w:w="150" w:type="dxa"/><w:left w:w="150" w:type="dxa"/><w:right w:w="150" w:type="dxa"/><w:bottom w:w="150" w:type="dxa"/></w:tblCellMar><w:tblBorders><w:top w:val="single" w:sz="4" w:color="B0BEC5"/><w:left w:val="single" w:sz="4" w:color="B0BEC5"/><w:right w:val="single" w:sz="4" w:color="B0BEC5"/><w:bottom w:val="single" w:sz="4" w:color="B0BEC5"/><w:insideH w:val="single" w:sz="4" w:color="B0BEC5"/><w:insideV w:val="single" w:sz="4" w:color="B0BEC5"/></w:tblBorders></w:tblPr><w:tr><w:trPr/><w:tc><w:tcPr><w:tcW w:w="10000" w:type="dxa"/><w:shd w:val="clear" w:fill="F1F5F9"/><w:noWrap/></w:tcPr><w:p/><w:p/><w:p><w:pPr><w:jc w:val="center"/></w:pPr><w:r><w:rPr><w:color w:val="94A3B8"/><w:sz w:val="24"/><w:szCs w:val="24"/><w:b w:val="1"/><w:bCs w:val="1"/></w:rPr><w:t xml:space="preserve">[ SCREENSHOT_5 - Halaman event dengan tema kustom ]</w:t></w:r></w:p><w:p><w:pPr><w:jc w:val="center"/></w:pPr><w:r><w:rPr><w:color w:val="B0BEC5"/><w:sz w:val="18"/><w:szCs w:val="18"/><w:i w:val="1"/><w:iCs w:val="1"/></w:rPr><w:t xml:space="preserve">(Tempatkan screenshot di sini, hapus border table setelahnya)</w:t></w:r></w:p><w:p/><w:p/></w:tc></w:tr></w:tbl><w:p/><w:p><w:r><w:br w:type="page"/></w:r></w:p><w:p><w:pPr><w:pStyle w:val="Heading1"/></w:pPr><w:bookmarkStart w:id="6" w:name="_Toc6"/><w:r><w:t>3. Siapa yang Butuh BARIS APP?</w:t></w:r><w:bookmarkEnd w:id="6"/></w:p><w:tbl><w:tblGrid><w:gridCol w:w="3000" w:type="dxa"/><w:gridCol w:w="3000" w:type="dxa"/></w:tblGrid><w:tblPr><w:tblW w:w="0" w:type="auto"/><w:tblLayout w:type="autofit"/><w:tblCellMar><w:top w:w="60" w:type="dxa"/><w:left w:w="60" w:type="dxa"/><w:right w:w="60" w:type="dxa"/><w:bottom w:w="60" w:type="dxa"/></w:tblCellMar><w:tblBorders><w:top w:val="single" w:sz="6" w:color="B0BEC5"/><w:left w:val="single" w:sz="6" w:color="B0BEC5"/><w:right w:val="single" w:sz="6" w:color="B0BEC5"/><w:bottom w:val="single" w:sz="6" w:color="B0BEC5"/><w:insideH w:val="single" w:sz="6" w:color="B0BEC5"/><w:insideV w:val="single" w:sz="6" w:color="B0BEC5"/></w:tblBorders></w:tblPr><w:tr><w:trPr/><w:tc><w:tcPr><w:tcW w:w="3000" w:type="dxa"/><w:shd w:val="clear" w:fill="0062FF"/><w:noWrap/></w:tcPr><w:p><w:pPr/><w:r><w:rPr><w:color w:val="FFFFFF"/><w:sz w:val="20"/><w:szCs w:val="20"/><w:b w:val="1"/><w:bCs w:val="1"/></w:rPr><w:t xml:space="preserve">Target</w:t></w:r></w:p></w:tc><w:tc><w:tcPr><w:tcW w:w="3000" w:type="dxa"/><w:shd w:val="clear" w:fill="0062FF"/><w:noWrap/></w:tcPr><w:p><w:pPr/><w:r><w:rPr><w:color w:val="FFFFFF"/><w:sz w:val="20"/><w:szCs w:val="20"/><w:b w:val="1"/><w:bCs w:val="1"/></w:rPr><w:t xml:space="preserve">Kebutuhan</w:t></w:r></w:p></w:tc></w:tr><w:tr><w:trPr/><w:tc><w:tcPr><w:tcW w:w="3000" w:type="dxa"/><w:noWrap/></w:tcPr><w:p><w:pPr/><w:r><w:rPr><w:sz w:val="20"/><w:szCs w:val="20"/></w:rPr><w:t xml:space="preserve">Sekolah / OSIS</w:t></w:r></w:p></w:tc><w:tc><w:tcPr><w:tcW w:w="3000" w:type="dxa"/><w:noWrap/></w:tcPr><w:p><w:pPr/><w:r><w:rPr><w:sz w:val="20"/><w:szCs w:val="20"/></w:rPr><w:t xml:space="preserve">Lomba PBB & paskibra dengan sistem profesional</w:t></w:r></w:p></w:tc></w:tr><w:tr><w:trPr/><w:tc><w:tcPr><w:tcW w:w="3000" w:type="dxa"/><w:noWrap/></w:tcPr><w:p><w:pPr/><w:r><w:rPr><w:sz w:val="20"/><w:szCs w:val="20"/></w:rPr><w:t xml:space="preserve">Pembina Paskibra</w:t></w:r></w:p></w:tc><w:tc><w:tcPr><w:tcW w:w="3000" w:type="dxa"/><w:noWrap/></w:tcPr><w:p><w:pPr/><w:r><w:rPr><w:sz w:val="20"/><w:szCs w:val="20"/></w:rPr><w:t xml:space="preserve">Penilaian juri transparan & real-time</w:t></w:r></w:p></w:tc></w:tr><w:tr><w:trPr/><w:tc><w:tcPr><w:tcW w:w="3000" w:type="dxa"/><w:noWrap/></w:tcPr><w:p><w:pPr/><w:r><w:rPr><w:sz w:val="20"/><w:szCs w:val="20"/></w:rPr><w:t xml:space="preserve">Pramuka</w:t></w:r></w:p></w:tc><w:tc><w:tcPr><w:tcW w:w="3000" w:type="dxa"/><w:noWrap/></w:tcPr><w:p><w:pPr/><w:r><w:rPr><w:sz w:val="20"/><w:szCs w:val="20"/></w:rPr><w:t xml:space="preserve">Lomba keterampilan tingkat kwarcab/kwaran</w:t></w:r></w:p></w:tc></w:tr><w:tr><w:trPr/><w:tc><w:tcPr><w:tcW w:w="3000" w:type="dxa"/><w:noWrap/></w:tcPr><w:p><w:pPr/><w:r><w:rPr><w:sz w:val="20"/><w:szCs w:val="20"/></w:rPr><w:t xml:space="preserve">Universitas</w:t></w:r></w:p></w:tc><w:tc><w:tcPr><w:tcW w:w="3000" w:type="dxa"/><w:noWrap/></w:tcPr><w:p><w:pPr/><w:r><w:rPr><w:sz w:val="20"/><w:szCs w:val="20"/></w:rPr><w:t xml:space="preserve">UKM, dies natalis, lomba antar fakultas</w:t></w:r></w:p></w:tc></w:tr><w:tr><w:trPr/><w:tc><w:tcPr><w:tcW w:w="3000" w:type="dxa"/><w:noWrap/></w:tcPr><w:p><w:pPr/><w:r><w:rPr><w:sz w:val="20"/><w:szCs w:val="20"/></w:rPr><w:t xml:space="preserve">Pemerintah Daerah</w:t></w:r></w:p></w:tc><w:tc><w:tcPr><w:tcW w:w="3000" w:type="dxa"/><w:noWrap/></w:tcPr><w:p><w:pPr/><w:r><w:rPr><w:sz w:val="20"/><w:szCs w:val="20"/></w:rPr><w:t xml:space="preserve">Event FORBASI tingkat kabupaten/provinsi</w:t></w:r></w:p></w:tc></w:tr><w:tr><w:trPr/><w:tc><w:tcPr><w:tcW w:w="3000" w:type="dxa"/><w:noWrap/></w:tcPr><w:p><w:pPr/><w:r><w:rPr><w:sz w:val="20"/><w:szCs w:val="20"/></w:rPr><w:t xml:space="preserve">Event Organizer</w:t></w:r></w:p></w:tc><w:tc><w:tcPr><w:tcW w:w="3000" w:type="dxa"/><w:noWrap/></w:tcPr><w:p><w:pPr/><w:r><w:rPr><w:sz w:val="20"/><w:szCs w:val="20"/></w:rPr><w:t xml:space="preserve">Platform siap pakai untuk klien event</w:t></w:r></w:p></w:tc></w:tr><w:tr><w:trPr/><w:tc><w:tcPr><w:tcW w:w="3000" w:type="dxa"/><w:noWrap/></w:tcPr><w:p><w:pPr/><w:r><w:rPr><w:sz w:val="20"/><w:szCs w:val="20"/></w:rPr><w:t xml:space="preserve">Komunitas</w:t></w:r></w:p></w:tc><w:tc><w:tcPr><w:tcW w:w="3000" w:type="dxa"/><w:noWrap/></w:tcPr><w:p><w:pPr/><w:r><w:rPr><w:sz w:val="20"/><w:szCs w:val="20"/></w:rPr><w:t xml:space="preserve">Turnamen dengan budget terbatas</w:t></w:r></w:p></w:tc></w:tr></w:tbl><w:p/><w:tbl><w:tblGrid><w:gridCol w:w="10000" w:type="dxa"/></w:tblGrid><w:tblPr><w:tblW w:w="0" w:type="auto"/><w:tblLayout w:type="autofit"/><w:tblCellMar><w:top w:w="150" w:type="dxa"/><w:left w:w="150" w:type="dxa"/><w:right w:w="150" w:type="dxa"/><w:bottom w:w="150" w:type="dxa"/></w:tblCellMar><w:tblBorders><w:top w:val="single" w:sz="4" w:color="B0BEC5"/><w:left w:val="single" w:sz="4" w:color="B0BEC5"/><w:right w:val="single" w:sz="4" w:color="B0BEC5"/><w:bottom w:val="single" w:sz="4" w:color="B0BEC5"/><w:insideH w:val="single" w:sz="4" w:color="B0BEC5"/><w:insideV w:val="single" w:sz="4" w:color="B0BEC5"/></w:tblBorders></w:tblPr><w:tr><w:trPr/><w:tc><w:tcPr><w:tcW w:w="10000" w:type="dxa"/><w:shd w:val="clear" w:fill="F1F5F9"/><w:noWrap/></w:tcPr><w:p/><w:p/><w:p><w:pPr><w:jc w:val="center"/></w:pPr><w:r><w:rPr><w:color w:val="94A3B8"/><w:sz w:val="24"/><w:szCs w:val="24"/><w:b w:val="1"/><w:bCs w:val="1"/></w:rPr><w:t xml:space="preserve">[ SCREENSHOT_6 - Tampilan mobile ]</w:t></w:r></w:p><w:p><w:pPr><w:jc w:val="center"/></w:pPr><w:r><w:rPr><w:color w:val="B0BEC5"/><w:sz w:val="18"/><w:szCs w:val="18"/><w:i w:val="1"/><w:iCs w:val="1"/></w:rPr><w:t xml:space="preserve">(Tempatkan screenshot di sini, hapus border table setelahnya)</w:t></w:r></w:p><w:p/><w:p/></w:tc></w:tr></w:tbl><w:p/><w:p><w:r><w:br w:type="page"/></w:r></w:p><w:p><w:pPr><w:pStyle w:val="Heading1"/></w:pPr><w:bookmarkStart w:id="7" w:name="_Toc7"/><w:r><w:t>4. Perbandingan Biaya</w:t></w:r><w:bookmarkEnd w:id="7"/></w:p><w:tbl><w:tblGrid><w:gridCol w:w="3000" w:type="dxa"/><w:gridCol w:w="3000" w:type="dxa"/><w:gridCol w:w="3000" w:type="dxa"/></w:tblGrid><w:tblPr><w:tblW w:w="0" w:type="auto"/><w:tblLayout w:type="autofit"/><w:tblCellMar><w:top w:w="60" w:type="dxa"/><w:left w:w="60" w:type="dxa"/><w:right w:w="60" w:type="dxa"/><w:bottom w:w="60" w:type="dxa"/></w:tblCellMar><w:tblBorders><w:top w:val="single" w:sz="6" w:color="B0BEC5"/><w:left w:val="single" w:sz="6" w:color="B0BEC5"/><w:right w:val="single" w:sz="6" w:color="B0BEC5"/><w:bottom w:val="single" w:sz="6" w:color="B0BEC5"/><w:insideH w:val="single" w:sz="6" w:color="B0BEC5"/><w:insideV w:val="single" w:sz="6" w:color="B0BEC5"/></w:tblBorders></w:tblPr><w:tr><w:trPr/><w:tc><w:tcPr><w:tcW w:w="3000" w:type="dxa"/><w:shd w:val="clear" w:fill="0062FF"/><w:noWrap/></w:tcPr><w:p><w:pPr/><w:r><w:rPr><w:color w:val="FFFFFF"/><w:sz w:val="20"/><w:szCs w:val="20"/><w:b w:val="1"/><w:bCs w:val="1"/></w:rPr><w:t xml:space="preserve">Platform</w:t></w:r></w:p></w:tc><w:tc><w:tcPr><w:tcW w:w="3000" w:type="dxa"/><w:shd w:val="clear" w:fill="0062FF"/><w:noWrap/></w:tcPr><w:p><w:pPr/><w:r><w:rPr><w:color w:val="FFFFFF"/><w:sz w:val="20"/><w:szCs w:val="20"/><w:b w:val="1"/><w:bCs w:val="1"/></w:rPr><w:t xml:space="preserve">Model Harga</w:t></w:r></w:p></w:tc><w:tc><w:tcPr><w:tcW w:w="3000" w:type="dxa"/><w:shd w:val="clear" w:fill="0062FF"/><w:noWrap/></w:tcPr><w:p><w:pPr/><w:r><w:rPr><w:color w:val="FFFFFF"/><w:sz w:val="20"/><w:szCs w:val="20"/><w:b w:val="1"/><w:bCs w:val="1"/></w:rPr><w:t xml:space="preserve">Estimasi / Event</w:t></w:r></w:p></w:tc></w:tr><w:tr><w:trPr/><w:tc><w:tcPr><w:tcW w:w="3000" w:type="dxa"/><w:noWrap/></w:tcPr><w:p><w:pPr/><w:r><w:rPr><w:sz w:val="20"/><w:szCs w:val="20"/></w:rPr><w:t xml:space="preserve">BARIS APP</w:t></w:r></w:p></w:tc><w:tc><w:tcPr><w:tcW w:w="3000" w:type="dxa"/><w:noWrap/></w:tcPr><w:p><w:pPr/><w:r><w:rPr><w:sz w:val="20"/><w:szCs w:val="20"/></w:rPr><w:t xml:space="preserve">Sekali bayar</w:t></w:r></w:p></w:tc><w:tc><w:tcPr><w:tcW w:w="3000" w:type="dxa"/><w:noWrap/></w:tcPr><w:p><w:pPr/><w:r><w:rPr><w:sz w:val="20"/><w:szCs w:val="20"/></w:rPr><w:t xml:space="preserve">Rp 50.000</w:t></w:r></w:p></w:tc></w:tr><w:tr><w:trPr/><w:tc><w:tcPr><w:tcW w:w="3000" w:type="dxa"/><w:noWrap/></w:tcPr><w:p><w:pPr/><w:r><w:rPr><w:sz w:val="20"/><w:szCs w:val="20"/></w:rPr><w:t xml:space="preserve">Platform A</w:t></w:r></w:p></w:tc><w:tc><w:tcPr><w:tcW w:w="3000" w:type="dxa"/><w:noWrap/></w:tcPr><w:p><w:pPr/><w:r><w:rPr><w:sz w:val="20"/><w:szCs w:val="20"/></w:rPr><w:t xml:space="preserve">Rp 500rb - 2jt / bulan</w:t></w:r></w:p></w:tc><w:tc><w:tcPr><w:tcW w:w="3000" w:type="dxa"/><w:noWrap/></w:tcPr><w:p><w:pPr/><w:r><w:rPr><w:sz w:val="20"/><w:szCs w:val="20"/></w:rPr><w:t xml:space="preserve">Rp 500.000 - 2.000.000</w:t></w:r></w:p></w:tc></w:tr><w:tr><w:trPr/><w:tc><w:tcPr><w:tcW w:w="3000" w:type="dxa"/><w:noWrap/></w:tcPr><w:p><w:pPr/><w:r><w:rPr><w:sz w:val="20"/><w:szCs w:val="20"/></w:rPr><w:t xml:space="preserve">Manual (kertas)</w:t></w:r></w:p></w:tc><w:tc><w:tcPr><w:tcW w:w="3000" w:type="dxa"/><w:noWrap/></w:tcPr><w:p><w:pPr/><w:r><w:rPr><w:sz w:val="20"/><w:szCs w:val="20"/></w:rPr><w:t xml:space="preserve">Cetak + lembur</w:t></w:r></w:p></w:tc><w:tc><w:tcPr><w:tcW w:w="3000" w:type="dxa"/><w:noWrap/></w:tcPr><w:p><w:pPr/><w:r><w:rPr><w:sz w:val="20"/><w:szCs w:val="20"/></w:rPr><w:t xml:space="preserve">> Rp 300.000</w:t></w:r></w:p></w:tc></w:tr><w:tr><w:trPr/><w:tc><w:tcPr><w:tcW w:w="3000" w:type="dxa"/><w:noWrap/></w:tcPr><w:p><w:pPr/><w:r><w:rPr><w:sz w:val="20"/><w:szCs w:val="20"/></w:rPr><w:t xml:space="preserve">Bangun sendiri</w:t></w:r></w:p></w:tc><w:tc><w:tcPr><w:tcW w:w="3000" w:type="dxa"/><w:noWrap/></w:tcPr><w:p><w:pPr/><w:r><w:rPr><w:sz w:val="20"/><w:szCs w:val="20"/></w:rPr><w:t xml:space="preserve">Developer 3-6 bulan</w:t></w:r></w:p></w:tc><w:tc><w:tcPr><w:tcW w:w="3000" w:type="dxa"/><w:noWrap/></w:tcPr><w:p><w:pPr/><w:r><w:rPr><w:sz w:val="20"/><w:szCs w:val="20"/></w:rPr><w:t xml:space="preserve">> Rp 50.000.000</w:t></w:r></w:p></w:tc></w:tr></w:tbl><w:p><w:pPr><w:jc w:val="center"/></w:pPr><w:r><w:rPr><w:color w:val="16A34A"/><w:sz w:val="24"/><w:szCs w:val="24"/><w:b w:val="1"/><w:bCs w:val="1"/></w:rPr><w:t xml:space="preserve">Hemat hingga 96% dibanding platform lain!</w:t></w:r></w:p><w:p><w:r><w:br w:type="page"/></w:r></w:p><w:p><w:pPr><w:pStyle w:val="Heading1"/></w:pPr><w:bookmarkStart w:id="8" w:name="_Toc8"/><w:r><w:t>5. Fitur Lengkap</w:t></w:r><w:bookmarkEnd w:id="8"/></w:p><w:p><w:pPr><w:pStyle w:val="Heading2"/></w:pPr><w:bookmarkStart w:id="9" w:name="_Toc9"/><w:r><w:t>Manajemen Event</w:t></w:r><w:bookmarkEnd w:id="9"/></w:p><w:p><w:pPr/><w:r><w:rPr><w:rStyle w:val="p"/></w:rPr><w:t xml:space="preserve">Profil event lengkap dengan halaman publik otomatis, tema kustom, dan subdomain sendiri.</w:t></w:r></w:p><w:p/><w:tbl><w:tblGrid><w:gridCol w:w="10000" w:type="dxa"/></w:tblGrid><w:tblPr><w:tblW w:w="0" w:type="auto"/><w:tblLayout w:type="autofit"/><w:tblCellMar><w:top w:w="150" w:type="dxa"/><w:left w:w="150" w:type="dxa"/><w:right w:w="150" w:type="dxa"/><w:bottom w:w="150" w:type="dxa"/></w:tblCellMar><w:tblBorders><w:top w:val="single" w:sz="4" w:color="B0BEC5"/><w:left w:val="single" w:sz="4" w:color="B0BEC5"/><w:right w:val="single" w:sz="4" w:color="B0BEC5"/><w:bottom w:val="single" w:sz="4" w:color="B0BEC5"/><w:insideH w:val="single" w:sz="4" w:color="B0BEC5"/><w:insideV w:val="single" w:sz="4" w:color="B0BEC5"/></w:tblBorders></w:tblPr><w:tr><w:trPr/><w:tc><w:tcPr><w:tcW w:w="10000" w:type="dxa"/><w:shd w:val="clear" w:fill="F1F5F9"/><w:noWrap/></w:tcPr><w:p/><w:p/><w:p><w:pPr><w:jc w:val="center"/></w:pPr><w:r><w:rPr><w:color w:val="94A3B8"/><w:sz w:val="24"/><w:szCs w:val="24"/><w:b w:val="1"/><w:bCs w:val="1"/></w:rPr><w:t xml:space="preserve">[ SCREENSHOT_7 - Profil event ]</w:t></w:r></w:p><w:p><w:pPr><w:jc w:val="center"/></w:pPr><w:r><w:rPr><w:color w:val="B0BEC5"/><w:sz w:val="18"/><w:szCs w:val="18"/><w:i w:val="1"/><w:iCs w:val="1"/></w:rPr><w:t xml:space="preserve">(Tempatkan screenshot di sini, hapus border table setelahnya)</w:t></w:r></w:p><w:p/><w:p/></w:tc></w:tr></w:tbl><w:p/><w:p><w:pPr><w:pStyle w:val="Heading2"/></w:pPr><w:bookmarkStart w:id="10" w:name="_Toc10"/><w:r><w:t>Pendaftaran & Peserta</w:t></w:r><w:bookmarkEnd w:id="10"/></w:p><w:p><w:pPr/><w:r><w:rPr><w:rStyle w:val="p"/></w:rPr><w:t xml:space="preserve">Pendaftaran multi-step: pilih kategori, data sekolah, konfirmasi. Magic link untuk isi data tim tanpa registrasi.</w:t></w:r></w:p><w:p/><w:tbl><w:tblGrid><w:gridCol w:w="10000" w:type="dxa"/></w:tblGrid><w:tblPr><w:tblW w:w="0" w:type="auto"/><w:tblLayout w:type="autofit"/><w:tblCellMar><w:top w:w="150" w:type="dxa"/><w:left w:w="150" w:type="dxa"/><w:right w:w="150" w:type="dxa"/><w:bottom w:w="150" w:type="dxa"/></w:tblCellMar><w:tblBorders><w:top w:val="single" w:sz="4" w:color="B0BEC5"/><w:left w:val="single" w:sz="4" w:color="B0BEC5"/><w:right w:val="single" w:sz="4" w:color="B0BEC5"/><w:bottom w:val="single" w:sz="4" w:color="B0BEC5"/><w:insideH w:val="single" w:sz="4" w:color="B0BEC5"/><w:insideV w:val="single" w:sz="4" w:color="B0BEC5"/></w:tblBorders></w:tblPr><w:tr><w:trPr/><w:tc><w:tcPr><w:tcW w:w="10000" w:type="dxa"/><w:shd w:val="clear" w:fill="F1F5F9"/><w:noWrap/></w:tcPr><w:p/><w:p/><w:p><w:pPr><w:jc w:val="center"/></w:pPr><w:r><w:rPr><w:color w:val="94A3B8"/><w:sz w:val="24"/><w:szCs w:val="24"/><w:b w:val="1"/><w:bCs w:val="1"/></w:rPr><w:t xml:space="preserve">[ SCREENSHOT_8 - Form pendaftaran ]</w:t></w:r></w:p><w:p><w:pPr><w:jc w:val="center"/></w:pPr><w:r><w:rPr><w:color w:val="B0BEC5"/><w:sz w:val="18"/><w:szCs w:val="18"/><w:i w:val="1"/><w:iCs w:val="1"/></w:rPr><w:t xml:space="preserve">(Tempatkan screenshot di sini, hapus border table setelahnya)</w:t></w:r></w:p><w:p/><w:p/></w:tc></w:tr></w:tbl><w:p/><w:p><w:pPr><w:pStyle w:val="Heading2"/></w:pPr><w:bookmarkStart w:id="11" w:name="_Toc11"/><w:r><w:t>Penilaian Digital</w:t></w:r><w:bookmarkEnd w:id="11"/></w:p><w:p><w:pPr/><w:r><w:rPr><w:rStyle w:val="p"/></w:rPr><w:t xml:space="preserve">Buat kategori penilaian dengan bobot. Juri nilai dari HP. Skor langsung terkalkulasi. Rekap otomatis.</w:t></w:r></w:p><w:p/><w:tbl><w:tblGrid><w:gridCol w:w="10000" w:type="dxa"/></w:tblGrid><w:tblPr><w:tblW w:w="0" w:type="auto"/><w:tblLayout w:type="autofit"/><w:tblCellMar><w:top w:w="150" w:type="dxa"/><w:left w:w="150" w:type="dxa"/><w:right w:w="150" w:type="dxa"/><w:bottom w:w="150" w:type="dxa"/></w:tblCellMar><w:tblBorders><w:top w:val="single" w:sz="4" w:color="B0BEC5"/><w:left w:val="single" w:sz="4" w:color="B0BEC5"/><w:right w:val="single" w:sz="4" w:color="B0BEC5"/><w:bottom w:val="single" w:sz="4" w:color="B0BEC5"/><w:insideH w:val="single" w:sz="4" w:color="B0BEC5"/><w:insideV w:val="single" w:sz="4" w:color="B0BEC5"/></w:tblBorders></w:tblPr><w:tr><w:trPr/><w:tc><w:tcPr><w:tcW w:w="10000" w:type="dxa"/><w:shd w:val="clear" w:fill="F1F5F9"/><w:noWrap/></w:tcPr><w:p/><w:p/><w:p><w:pPr><w:jc w:val="center"/></w:pPr><w:r><w:rPr><w:color w:val="94A3B8"/><w:sz w:val="24"/><w:szCs w:val="24"/><w:b w:val="1"/><w:bCs w:val="1"/></w:rPr><w:t xml:space="preserve">[ SCREENSHOT_9 - Input nilai juri ]</w:t></w:r></w:p><w:p><w:pPr><w:jc w:val="center"/></w:pPr><w:r><w:rPr><w:color w:val="B0BEC5"/><w:sz w:val="18"/><w:szCs w:val="18"/><w:i w:val="1"/><w:iCs w:val="1"/></w:rPr><w:t xml:space="preserve">(Tempatkan screenshot di sini, hapus border table setelahnya)</w:t></w:r></w:p><w:p/><w:p/></w:tc></w:tr></w:tbl><w:p/><w:p><w:pPr><w:pStyle w:val="Heading2"/></w:pPr><w:bookmarkStart w:id="12" w:name="_Toc12"/><w:r><w:t>Voting Penonton</w:t></w:r><w:bookmarkEnd w:id="12"/></w:p><w:p><w:pPr/><w:r><w:rPr><w:rStyle w:val="p"/></w:rPr><w:t xml:space="preserve">Support via vote berbayar QRIS. Hasil live. Recap PDF.</w:t></w:r></w:p><w:p/><w:tbl><w:tblGrid><w:gridCol w:w="10000" w:type="dxa"/></w:tblGrid><w:tblPr><w:tblW w:w="0" w:type="auto"/><w:tblLayout w:type="autofit"/><w:tblCellMar><w:top w:w="150" w:type="dxa"/><w:left w:w="150" w:type="dxa"/><w:right w:w="150" w:type="dxa"/><w:bottom w:w="150" w:type="dxa"/></w:tblCellMar><w:tblBorders><w:top w:val="single" w:sz="4" w:color="B0BEC5"/><w:left w:val="single" w:sz="4" w:color="B0BEC5"/><w:right w:val="single" w:sz="4" w:color="B0BEC5"/><w:bottom w:val="single" w:sz="4" w:color="B0BEC5"/><w:insideH w:val="single" w:sz="4" w:color="B0BEC5"/><w:insideV w:val="single" w:sz="4" w:color="B0BEC5"/></w:tblBorders></w:tblPr><w:tr><w:trPr/><w:tc><w:tcPr><w:tcW w:w="10000" w:type="dxa"/><w:shd w:val="clear" w:fill="F1F5F9"/><w:noWrap/></w:tcPr><w:p/><w:p/><w:p><w:pPr><w:jc w:val="center"/></w:pPr><w:r><w:rPr><w:color w:val="94A3B8"/><w:sz w:val="24"/><w:szCs w:val="24"/><w:b w:val="1"/><w:bCs w:val="1"/></w:rPr><w:t xml:space="preserve">[ SCREENSHOT_10 - Voting publik ]</w:t></w:r></w:p><w:p><w:pPr><w:jc w:val="center"/></w:pPr><w:r><w:rPr><w:color w:val="B0BEC5"/><w:sz w:val="18"/><w:szCs w:val="18"/><w:i w:val="1"/><w:iCs w:val="1"/></w:rPr><w:t xml:space="preserve">(Tempatkan screenshot di sini, hapus border table setelahnya)</w:t></w:r></w:p><w:p/><w:p/></w:tc></w:tr></w:tbl><w:p/><w:p><w:pPr><w:pStyle w:val="Heading2"/></w:pPr><w:bookmarkStart w:id="13" w:name="_Toc13"/><w:r><w:t>Tiket Event</w:t></w:r><w:bookmarkEnd w:id="13"/></w:p><w:p><w:pPr/><w:r><w:rPr><w:rStyle w:val="p"/></w:rPr><w:t xml:space="preserve">Jual tiket online. QRIS. QR Code check-in.</w:t></w:r></w:p><w:p/><w:tbl><w:tblGrid><w:gridCol w:w="10000" w:type="dxa"/></w:tblGrid><w:tblPr><w:tblW w:w="0" w:type="auto"/><w:tblLayout w:type="autofit"/><w:tblCellMar><w:top w:w="150" w:type="dxa"/><w:left w:w="150" w:type="dxa"/><w:right w:w="150" w:type="dxa"/><w:bottom w:w="150" w:type="dxa"/></w:tblCellMar><w:tblBorders><w:top w:val="single" w:sz="4" w:color="B0BEC5"/><w:left w:val="single" w:sz="4" w:color="B0BEC5"/><w:right w:val="single" w:sz="4" w:color="B0BEC5"/><w:bottom w:val="single" w:sz="4" w:color="B0BEC5"/><w:insideH w:val="single" w:sz="4" w:color="B0BEC5"/><w:insideV w:val="single" w:sz="4" w:color="B0BEC5"/></w:tblBorders></w:tblPr><w:tr><w:trPr/><w:tc><w:tcPr><w:tcW w:w="10000" w:type="dxa"/><w:shd w:val="clear" w:fill="F1F5F9"/><w:noWrap/></w:tcPr><w:p/><w:p/><w:p><w:pPr><w:jc w:val="center"/></w:pPr><w:r><w:rPr><w:color w:val="94A3B8"/><w:sz w:val="24"/><w:szCs w:val="24"/><w:b w:val="1"/><w:bCs w:val="1"/></w:rPr><w:t xml:space="preserve">[ SCREENSHOT_11 - Pembelian tiket ]</w:t></w:r></w:p><w:p><w:pPr><w:jc w:val="center"/></w:pPr><w:r><w:rPr><w:color w:val="B0BEC5"/><w:sz w:val="18"/><w:szCs w:val="18"/><w:i w:val="1"/><w:iCs w:val="1"/></w:rPr><w:t xml:space="preserve">(Tempatkan screenshot di sini, hapus border table setelahnya)</w:t></w:r></w:p><w:p/><w:p/></w:tc></w:tr></w:tbl><w:p/><w:p><w:pPr><w:pStyle w:val="Heading2"/></w:pPr><w:bookmarkStart w:id="14" w:name="_Toc14"/><w:r><w:t>Overlay & Scoreboard</w:t></w:r><w:bookmarkEnd w:id="14"/></w:p><w:p><w:pPr/><w:r><w:rPr><w:rStyle w:val="p"/></w:rPr><w:t xml:space="preserve">Tampilan OBS profesional. Mode: full, vote, kegiatan, greenscreen. Marquee leaderboard. Scoreboard publik.</w:t></w:r></w:p><w:p/><w:tbl><w:tblGrid><w:gridCol w:w="10000" w:type="dxa"/></w:tblGrid><w:tblPr><w:tblW w:w="0" w:type="auto"/><w:tblLayout w:type="autofit"/><w:tblCellMar><w:top w:w="150" w:type="dxa"/><w:left w:w="150" w:type="dxa"/><w:right w:w="150" w:type="dxa"/><w:bottom w:w="150" w:type="dxa"/></w:tblCellMar><w:tblBorders><w:top w:val="single" w:sz="4" w:color="B0BEC5"/><w:left w:val="single" w:sz="4" w:color="B0BEC5"/><w:right w:val="single" w:sz="4" w:color="B0BEC5"/><w:bottom w:val="single" w:sz="4" w:color="B0BEC5"/><w:insideH w:val="single" w:sz="4" w:color="B0BEC5"/><w:insideV w:val="single" w:sz="4" w:color="B0BEC5"/></w:tblBorders></w:tblPr><w:tr><w:trPr/><w:tc><w:tcPr><w:tcW w:w="10000" w:type="dxa"/><w:shd w:val="clear" w:fill="F1F5F9"/><w:noWrap/></w:tcPr><w:p/><w:p/><w:p><w:pPr><w:jc w:val="center"/></w:pPr><w:r><w:rPr><w:color w:val="94A3B8"/><w:sz w:val="24"/><w:szCs w:val="24"/><w:b w:val="1"/><w:bCs w:val="1"/></w:rPr><w:t xml:space="preserve">[ SCREENSHOT_12 - Overlay livestream ]</w:t></w:r></w:p><w:p><w:pPr><w:jc w:val="center"/></w:pPr><w:r><w:rPr><w:color w:val="B0BEC5"/><w:sz w:val="18"/><w:szCs w:val="18"/><w:i w:val="1"/><w:iCs w:val="1"/></w:rPr><w:t xml:space="preserve">(Tempatkan screenshot di sini, hapus border table setelahnya)</w:t></w:r></w:p><w:p/><w:p/></w:tc></w:tr></w:tbl><w:p/><w:p><w:pPr><w:pStyle w:val="Heading2"/></w:pPr><w:bookmarkStart w:id="15" w:name="_Toc15"/><w:r><w:t>Drawing, Champion & More</w:t></w:r><w:bookmarkEnd w:id="15"/></w:p><w:p><w:pPr/><w:r><w:rPr><w:rStyle w:val="p"/></w:rPr><w:t xml:space="preserve">Layar spin undian. Champion generator. Sponsor, tenant, FAQ, galeri. Activity log.</w:t></w:r></w:p><w:p/><w:tbl><w:tblGrid><w:gridCol w:w="10000" w:type="dxa"/></w:tblGrid><w:tblPr><w:tblW w:w="0" w:type="auto"/><w:tblLayout w:type="autofit"/><w:tblCellMar><w:top w:w="150" w:type="dxa"/><w:left w:w="150" w:type="dxa"/><w:right w:w="150" w:type="dxa"/><w:bottom w:w="150" w:type="dxa"/></w:tblCellMar><w:tblBorders><w:top w:val="single" w:sz="4" w:color="B0BEC5"/><w:left w:val="single" w:sz="4" w:color="B0BEC5"/><w:right w:val="single" w:sz="4" w:color="B0BEC5"/><w:bottom w:val="single" w:sz="4" w:color="B0BEC5"/><w:insideH w:val="single" w:sz="4" w:color="B0BEC5"/><w:insideV w:val="single" w:sz="4" w:color="B0BEC5"/></w:tblBorders></w:tblPr><w:tr><w:trPr/><w:tc><w:tcPr><w:tcW w:w="10000" w:type="dxa"/><w:shd w:val="clear" w:fill="F1F5F9"/><w:noWrap/></w:tcPr><w:p/><w:p/><w:p><w:pPr><w:jc w:val="center"/></w:pPr><w:r><w:rPr><w:color w:val="94A3B8"/><w:sz w:val="24"/><w:szCs w:val="24"/><w:b w:val="1"/><w:bCs w:val="1"/></w:rPr><w:t xml:space="preserve">[ SCREENSHOT_13 - Drawing spin ]</w:t></w:r></w:p><w:p><w:pPr><w:jc w:val="center"/></w:pPr><w:r><w:rPr><w:color w:val="B0BEC5"/><w:sz w:val="18"/><w:szCs w:val="18"/><w:i w:val="1"/><w:iCs w:val="1"/></w:rPr><w:t xml:space="preserve">(Tempatkan screenshot di sini, hapus border table setelahnya)</w:t></w:r></w:p><w:p/><w:p/></w:tc></w:tr></w:tbl><w:p/><w:p><w:r><w:br w:type="page"/></w:r></w:p><w:p><w:pPr><w:pStyle w:val="Heading1"/></w:pPr><w:bookmarkStart w:id="16" w:name="_Toc16"/><w:r><w:t>Hubungi Kami</w:t></w:r><w:bookmarkEnd w:id="16"/></w:p><w:p><w:pPr><w:spacing w:after="80"/></w:pPr><w:r><w:rPr><w:sz w:val="24"/><w:szCs w:val="24"/></w:rPr><w:t xml:space="preserve">Website: https://berbaris.app</w:t></w:r></w:p><w:p><w:pPr><w:spacing w:after="80"/></w:pPr><w:r><w:rPr><w:sz w:val="24"/><w:szCs w:val="24"/></w:rPr><w:t xml:space="preserve">Email: support@berbaris.app</w:t></w:r></w:p><w:p><w:pPr><w:spacing w:after="80"/></w:pPr><w:r><w:rPr><w:sz w:val="24"/><w:szCs w:val="24"/></w:rPr><w:t xml:space="preserve">Instagram: @berbaris.app</w:t></w:r></w:p><w:p/><w:p/><w:p><w:pPr><w:jc w:val="center"/></w:pPr><w:r><w:rPr><w:color w:val="475569"/><w:sz w:val="22"/><w:szCs w:val="22"/><w:i w:val="1"/><w:iCs w:val="1"/></w:rPr><w:t xml:space="preserve">"BARIS APP - Bikin event kompetisimu profesional, modern, dan bebas ribet. Cukup satu platform untuk semua kebutuhan. Gratis coba 3 hari. Bayar sekali, pakai selamanya."</w:t></w:r></w:p><w:p/><w:p/><w:p/><w:p/><w:p><w:pPr><w:jc w:val="center"/></w:pPr><w:r><w:rPr><w:color w:val="94A3B8"/><w:sz w:val="18"/><w:szCs w:val="18"/></w:rPr><w:t xml:space="preserve">BARIS APP - Platform Manajemen Event & Kompetisi Terpadu</w:t></w:r></w:p><w:sectPr><w:pgSz w:orient="portrait" w:w="11905.511811023622" w:h="16837.79527559055"/><w:pgMar w:top="1440" w:right="1440" w:bottom="1440" w:left="1440" w:header="720" w:footer="720" w:gutter="0"/><w:cols w:num="1" w:space="720"/></w:sectPr></w:body></w:document>
 </file>
 
 <file path=word/comments.xml><?xml version="1.0" encoding="utf-8"?>
@@ -65,168 +65,12 @@
       <w:bCs w:val="1"/>
     </w:rPr>
   </w:style>
-  <w:style w:type="paragraph" w:styleId="Heading3">
-    <w:link w:val="Heading3Char"/>
-    <w:name w:val="heading 3"/>
-    <w:basedOn w:val="Normal"/>
-    <w:pPr>
-      <w:spacing w:before="200" w:after="100"/>
-    </w:pPr>
-    <w:rPr>
-      <w:color w:val="334155"/>
-      <w:sz w:val="26"/>
-      <w:szCs w:val="26"/>
-      <w:b w:val="1"/>
-      <w:bCs w:val="1"/>
-    </w:rPr>
-  </w:style>
-  <w:style w:type="paragraph" w:customStyle="1" w:styleId="normal">
-    <w:name w:val="normal"/>
+  <w:style w:type="paragraph" w:customStyle="1" w:styleId="p">
+    <w:name w:val="p"/>
     <w:basedOn w:val="Normal"/>
     <w:pPr>
       <w:spacing w:after="120" w:line="312" w:lineRule="auto"/>
     </w:pPr>
-  </w:style>
-  <w:style w:type="paragraph" w:customStyle="1" w:styleId="listitem">
-    <w:name w:val="listitem"/>
-    <w:basedOn w:val="Normal"/>
-    <w:pPr>
-      <w:ind w:left="400" w:right="0" w:firstLine="0" w:hanging="0"/>
-      <w:spacing w:after="60"/>
-    </w:pPr>
-  </w:style>
-  <w:style w:type="paragraph" w:customStyle="1" w:styleId="center">
-    <w:name w:val="center"/>
-    <w:basedOn w:val="Normal"/>
-    <w:pPr>
-      <w:jc w:val="center"/>
-      <w:spacing w:after="120"/>
-    </w:pPr>
-  </w:style>
-  <w:style w:type="table" w:customStyle="1" w:styleId="probTable">
-    <w:name w:val="probTable"/>
-    <w:uiPriority w:val="99"/>
-    <w:tblPr>
-      <w:tblW w:w="0" w:type="auto"/>
-      <w:tblLayout w:type="autofit"/>
-      <w:tblCellMar>
-        <w:top w:w="80" w:type="dxa"/>
-        <w:left w:w="80" w:type="dxa"/>
-        <w:right w:w="80" w:type="dxa"/>
-        <w:bottom w:w="80" w:type="dxa"/>
-      </w:tblCellMar>
-      <w:tblBorders>
-        <w:top w:val="single" w:sz="6" w:color="E2E8F0"/>
-        <w:left w:val="single" w:sz="6" w:color="E2E8F0"/>
-        <w:right w:val="single" w:sz="6" w:color="E2E8F0"/>
-        <w:bottom w:val="single" w:sz="6" w:color="E2E8F0"/>
-        <w:insideH w:val="single" w:sz="6" w:color="E2E8F0"/>
-        <w:insideV w:val="single" w:sz="6" w:color="E2E8F0"/>
-      </w:tblBorders>
-    </w:tblPr>
-    <w:tblStylePr w:type="firstRow">
-      <w:tcPr/>
-    </w:tblStylePr>
-  </w:style>
-  <w:style w:type="table" w:customStyle="1" w:styleId="fiturTable">
-    <w:name w:val="fiturTable"/>
-    <w:uiPriority w:val="99"/>
-    <w:tblPr>
-      <w:tblW w:w="0" w:type="auto"/>
-      <w:tblLayout w:type="autofit"/>
-      <w:tblCellMar>
-        <w:top w:w="80" w:type="dxa"/>
-        <w:left w:w="80" w:type="dxa"/>
-        <w:right w:w="80" w:type="dxa"/>
-        <w:bottom w:w="80" w:type="dxa"/>
-      </w:tblCellMar>
-      <w:tblBorders>
-        <w:top w:val="single" w:sz="6" w:color="E2E8F0"/>
-        <w:left w:val="single" w:sz="6" w:color="E2E8F0"/>
-        <w:right w:val="single" w:sz="6" w:color="E2E8F0"/>
-        <w:bottom w:val="single" w:sz="6" w:color="E2E8F0"/>
-        <w:insideH w:val="single" w:sz="6" w:color="E2E8F0"/>
-        <w:insideV w:val="single" w:sz="6" w:color="E2E8F0"/>
-      </w:tblBorders>
-    </w:tblPr>
-    <w:tblStylePr w:type="firstRow">
-      <w:tcPr/>
-    </w:tblStylePr>
-  </w:style>
-  <w:style w:type="table" w:customStyle="1" w:styleId="priceTable">
-    <w:name w:val="priceTable"/>
-    <w:uiPriority w:val="99"/>
-    <w:tblPr>
-      <w:tblW w:w="0" w:type="auto"/>
-      <w:tblLayout w:type="autofit"/>
-      <w:tblCellMar>
-        <w:top w:w="100" w:type="dxa"/>
-        <w:left w:w="100" w:type="dxa"/>
-        <w:right w:w="100" w:type="dxa"/>
-        <w:bottom w:w="100" w:type="dxa"/>
-      </w:tblCellMar>
-      <w:tblBorders>
-        <w:top w:val="single" w:sz="6" w:color="E2E8F0"/>
-        <w:left w:val="single" w:sz="6" w:color="E2E8F0"/>
-        <w:right w:val="single" w:sz="6" w:color="E2E8F0"/>
-        <w:bottom w:val="single" w:sz="6" w:color="E2E8F0"/>
-        <w:insideH w:val="single" w:sz="6" w:color="E2E8F0"/>
-        <w:insideV w:val="single" w:sz="6" w:color="E2E8F0"/>
-      </w:tblBorders>
-    </w:tblPr>
-    <w:tblStylePr w:type="firstRow">
-      <w:tcPr/>
-    </w:tblStylePr>
-  </w:style>
-  <w:style w:type="table" w:customStyle="1" w:styleId="targetTable">
-    <w:name w:val="targetTable"/>
-    <w:uiPriority w:val="99"/>
-    <w:tblPr>
-      <w:tblW w:w="0" w:type="auto"/>
-      <w:tblLayout w:type="autofit"/>
-      <w:tblCellMar>
-        <w:top w:w="80" w:type="dxa"/>
-        <w:left w:w="80" w:type="dxa"/>
-        <w:right w:w="80" w:type="dxa"/>
-        <w:bottom w:w="80" w:type="dxa"/>
-      </w:tblCellMar>
-      <w:tblBorders>
-        <w:top w:val="single" w:sz="6" w:color="E2E8F0"/>
-        <w:left w:val="single" w:sz="6" w:color="E2E8F0"/>
-        <w:right w:val="single" w:sz="6" w:color="E2E8F0"/>
-        <w:bottom w:val="single" w:sz="6" w:color="E2E8F0"/>
-        <w:insideH w:val="single" w:sz="6" w:color="E2E8F0"/>
-        <w:insideV w:val="single" w:sz="6" w:color="E2E8F0"/>
-      </w:tblBorders>
-    </w:tblPr>
-    <w:tblStylePr w:type="firstRow">
-      <w:tcPr/>
-    </w:tblStylePr>
-  </w:style>
-  <w:style w:type="table" w:customStyle="1" w:styleId="costTable">
-    <w:name w:val="costTable"/>
-    <w:uiPriority w:val="99"/>
-    <w:tblPr>
-      <w:tblW w:w="0" w:type="auto"/>
-      <w:tblLayout w:type="autofit"/>
-      <w:tblCellMar>
-        <w:top w:w="80" w:type="dxa"/>
-        <w:left w:w="80" w:type="dxa"/>
-        <w:right w:w="80" w:type="dxa"/>
-        <w:bottom w:w="80" w:type="dxa"/>
-      </w:tblCellMar>
-      <w:tblBorders>
-        <w:top w:val="single" w:sz="6" w:color="E2E8F0"/>
-        <w:left w:val="single" w:sz="6" w:color="E2E8F0"/>
-        <w:right w:val="single" w:sz="6" w:color="E2E8F0"/>
-        <w:bottom w:val="single" w:sz="6" w:color="E2E8F0"/>
-        <w:insideH w:val="single" w:sz="6" w:color="E2E8F0"/>
-        <w:insideV w:val="single" w:sz="6" w:color="E2E8F0"/>
-      </w:tblBorders>
-    </w:tblPr>
-    <w:tblStylePr w:type="firstRow">
-      <w:tcPr/>
-    </w:tblStylePr>
   </w:style>
 </w:styles>
 </file>

</xml_diff>